<commit_message>
Finish + documentation + dist
</commit_message>
<xml_diff>
--- a/Dokumentace projektu Maze Solver.docx
+++ b/Dokumentace projektu Maze Solver.docx
@@ -43,7 +43,7 @@
             <mc:AlternateContent>
               <mc:Choice Requires="wps">
                 <w:drawing>
-                  <wp:anchor distT="0" distB="0" distL="114300" distR="114300" simplePos="0" relativeHeight="251655168" behindDoc="0" locked="0" layoutInCell="1" allowOverlap="1" wp14:anchorId="4BDA6DA7" wp14:editId="2838616E">
+                  <wp:anchor distT="0" distB="0" distL="114300" distR="114300" simplePos="0" relativeHeight="251656192" behindDoc="0" locked="0" layoutInCell="1" allowOverlap="1" wp14:anchorId="4BDA6DA7" wp14:editId="2838616E">
                     <wp:simplePos x="0" y="0"/>
                     <wp:positionH relativeFrom="page">
                       <wp:posOffset>771525</wp:posOffset>
@@ -230,7 +230,7 @@
                     <v:stroke joinstyle="miter"/>
                     <v:path gradientshapeok="t" o:connecttype="rect"/>
                   </v:shapetype>
-                  <v:shape id="Textové pole 113" o:spid="_x0000_s1026" type="#_x0000_t202" style="position:absolute;margin-left:60.75pt;margin-top:5in;width:479.15pt;height:41.4pt;z-index:251655168;visibility:visible;mso-wrap-style:square;mso-width-percent:0;mso-height-percent:363;mso-wrap-distance-left:9pt;mso-wrap-distance-top:0;mso-wrap-distance-right:9pt;mso-wrap-distance-bottom:0;mso-position-horizontal:absolute;mso-position-horizontal-relative:page;mso-position-vertical:absolute;mso-position-vertical-relative:page;mso-width-percent:0;mso-height-percent:363;mso-width-relative:page;mso-height-relative:page;v-text-anchor:bottom" o:gfxdata="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" filled="f" stroked="f" strokeweight=".5pt">
+                  <v:shape id="Textové pole 113" o:spid="_x0000_s1026" type="#_x0000_t202" style="position:absolute;margin-left:60.75pt;margin-top:5in;width:479.15pt;height:41.4pt;z-index:251656192;visibility:visible;mso-wrap-style:square;mso-width-percent:0;mso-height-percent:363;mso-wrap-distance-left:9pt;mso-wrap-distance-top:0;mso-wrap-distance-right:9pt;mso-wrap-distance-bottom:0;mso-position-horizontal:absolute;mso-position-horizontal-relative:page;mso-position-vertical:absolute;mso-position-vertical-relative:page;mso-width-percent:0;mso-height-percent:363;mso-width-relative:page;mso-height-relative:page;v-text-anchor:bottom" o:gfxdata="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" filled="f" stroked="f" strokeweight=".5pt">
                     <v:textbox inset="0,0,0,0">
                       <w:txbxContent>
                         <w:p>
@@ -362,7 +362,7 @@
             <mc:AlternateContent>
               <mc:Choice Requires="wps">
                 <w:drawing>
-                  <wp:anchor distT="0" distB="0" distL="114300" distR="114300" simplePos="0" relativeHeight="251662336" behindDoc="0" locked="0" layoutInCell="1" allowOverlap="1" wp14:anchorId="0B86ED80" wp14:editId="52520504">
+                  <wp:anchor distT="0" distB="0" distL="114300" distR="114300" simplePos="0" relativeHeight="251661312" behindDoc="0" locked="0" layoutInCell="1" allowOverlap="1" wp14:anchorId="0B86ED80" wp14:editId="52520504">
                     <wp:simplePos x="0" y="0"/>
                     <mc:AlternateContent>
                       <mc:Choice Requires="wp14">
@@ -493,7 +493,7 @@
               </mc:Choice>
               <mc:Fallback>
                 <w:pict>
-                  <v:shape w14:anchorId="0B86ED80" id="Textové pole 111" o:spid="_x0000_s1027" type="#_x0000_t202" style="position:absolute;margin-left:0;margin-top:0;width:288.25pt;height:287.5pt;z-index:251662336;visibility:visible;mso-wrap-style:square;mso-width-percent:734;mso-height-percent:363;mso-left-percent:150;mso-top-percent:91;mso-wrap-distance-left:9pt;mso-wrap-distance-top:0;mso-wrap-distance-right:9pt;mso-wrap-distance-bottom:0;mso-position-horizontal-relative:page;mso-position-vertical-relative:page;mso-width-percent:734;mso-height-percent:363;mso-left-percent:150;mso-top-percent:91;mso-width-relative:page;mso-height-relative:page;v-text-anchor:bottom" o:gfxdata="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" filled="f" stroked="f" strokeweight=".5pt">
+                  <v:shape w14:anchorId="0B86ED80" id="Textové pole 111" o:spid="_x0000_s1027" type="#_x0000_t202" style="position:absolute;margin-left:0;margin-top:0;width:288.25pt;height:287.5pt;z-index:251661312;visibility:visible;mso-wrap-style:square;mso-width-percent:734;mso-height-percent:363;mso-left-percent:150;mso-top-percent:91;mso-wrap-distance-left:9pt;mso-wrap-distance-top:0;mso-wrap-distance-right:9pt;mso-wrap-distance-bottom:0;mso-position-horizontal-relative:page;mso-position-vertical-relative:page;mso-width-percent:734;mso-height-percent:363;mso-left-percent:150;mso-top-percent:91;mso-width-relative:page;mso-height-relative:page;v-text-anchor:bottom" o:gfxdata="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" filled="f" stroked="f" strokeweight=".5pt">
                     <v:textbox style="mso-fit-shape-to-text:t" inset="0,0,0,0">
                       <w:txbxContent>
                         <w:sdt>
@@ -555,7 +555,7 @@
             <mc:AlternateContent>
               <mc:Choice Requires="wps">
                 <w:drawing>
-                  <wp:anchor distT="0" distB="0" distL="114300" distR="114300" simplePos="0" relativeHeight="251658240" behindDoc="0" locked="0" layoutInCell="1" allowOverlap="1" wp14:anchorId="2F97492A" wp14:editId="7755734C">
+                  <wp:anchor distT="0" distB="0" distL="114300" distR="114300" simplePos="0" relativeHeight="251659264" behindDoc="0" locked="0" layoutInCell="1" allowOverlap="1" wp14:anchorId="2F97492A" wp14:editId="7755734C">
                     <wp:simplePos x="0" y="0"/>
                     <mc:AlternateContent>
                       <mc:Choice Requires="wp14">
@@ -783,7 +783,7 @@
               </mc:Choice>
               <mc:Fallback>
                 <w:pict>
-                  <v:shape w14:anchorId="2F97492A" id="Textové pole 112" o:spid="_x0000_s1028" type="#_x0000_t202" style="position:absolute;margin-left:0;margin-top:0;width:453pt;height:51.4pt;z-index:251658240;visibility:visible;mso-wrap-style:square;mso-width-percent:734;mso-height-percent:80;mso-left-percent:150;mso-top-percent:837;mso-wrap-distance-left:9pt;mso-wrap-distance-top:0;mso-wrap-distance-right:9pt;mso-wrap-distance-bottom:0;mso-position-horizontal-relative:page;mso-position-vertical-relative:page;mso-width-percent:734;mso-height-percent:80;mso-left-percent:150;mso-top-percent:837;mso-width-relative:page;mso-height-relative:page;v-text-anchor:bottom" o:gfxdata="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" filled="f" stroked="f" strokeweight=".5pt">
+                  <v:shape w14:anchorId="2F97492A" id="Textové pole 112" o:spid="_x0000_s1028" type="#_x0000_t202" style="position:absolute;margin-left:0;margin-top:0;width:453pt;height:51.4pt;z-index:251659264;visibility:visible;mso-wrap-style:square;mso-width-percent:734;mso-height-percent:80;mso-left-percent:150;mso-top-percent:837;mso-wrap-distance-left:9pt;mso-wrap-distance-top:0;mso-wrap-distance-right:9pt;mso-wrap-distance-bottom:0;mso-position-horizontal-relative:page;mso-position-vertical-relative:page;mso-width-percent:734;mso-height-percent:80;mso-left-percent:150;mso-top-percent:837;mso-width-relative:page;mso-height-relative:page;v-text-anchor:bottom" o:gfxdata="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" filled="f" stroked="f" strokeweight=".5pt">
                     <v:textbox inset="0,0,0,0">
                       <w:txbxContent>
                         <w:sdt>
@@ -1074,7 +1074,7 @@
               </mc:Choice>
               <mc:Fallback>
                 <w:pict>
-                  <v:group w14:anchorId="3660BFDA" id="Skupina 115" o:spid="_x0000_s1026" style="position:absolute;margin-left:0;margin-top:0;width:18pt;height:10in;z-index:251653120;mso-width-percent:29;mso-height-percent:909;mso-left-percent:45;mso-position-horizontal-relative:page;mso-position-vertical:center;mso-position-vertical-relative:page;mso-width-percent:29;mso-height-percent:909;mso-left-percent:45" coordsize="2286,91440" o:gfxdata="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">
+                  <v:group w14:anchorId="43781E20" id="Skupina 115" o:spid="_x0000_s1026" style="position:absolute;margin-left:0;margin-top:0;width:18pt;height:10in;z-index:251653120;mso-width-percent:29;mso-height-percent:909;mso-left-percent:45;mso-position-horizontal-relative:page;mso-position-vertical:center;mso-position-vertical-relative:page;mso-width-percent:29;mso-height-percent:909;mso-left-percent:45" coordsize="2286,91440" o:gfxdata="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">
                     <v:rect id="Obdélník 115" o:spid="_x0000_s1027" style="position:absolute;width:2286;height:87820;visibility:visible;mso-wrap-style:square;v-text-anchor:middle" o:gfxdata="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" fillcolor="#c0504d [3205]" stroked="f" strokeweight="2pt"/>
                     <v:rect id="Obdélník 116" o:spid="_x0000_s1028" style="position:absolute;top:89154;width:2286;height:2286;visibility:visible;mso-wrap-style:square;v-text-anchor:middle" o:gfxdata="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" fillcolor="#4f81bd [3204]" stroked="f" strokeweight="2pt">
                       <o:lock v:ext="edit" aspectratio="t"/>
@@ -1562,7 +1562,14 @@
               <w:tab w:val="right" w:leader="dot" w:pos="9984"/>
             </w:tabs>
             <w:rPr>
+              <w:rFonts w:asciiTheme="minorHAnsi" w:hAnsiTheme="minorHAnsi"/>
               <w:noProof/>
+              <w:color w:val="auto"/>
+              <w:kern w:val="2"/>
+              <w:sz w:val="24"/>
+              <w:szCs w:val="24"/>
+              <w:lang w:val="cs-CZ" w:eastAsia="cs-CZ"/>
+              <w14:ligatures w14:val="standardContextual"/>
             </w:rPr>
           </w:pPr>
           <w:r>
@@ -1574,13 +1581,13 @@
           <w:r>
             <w:fldChar w:fldCharType="separate"/>
           </w:r>
-          <w:hyperlink w:anchor="_Toc243725539" w:history="1">
+          <w:hyperlink w:anchor="_Toc243734663" w:history="1">
             <w:r>
               <w:rPr>
                 <w:rStyle w:val="Hypertextovodkaz"/>
                 <w:noProof/>
               </w:rPr>
-              <w:t>Obsah</w:t>
+              <w:t>1 Přehled projektu</w:t>
             </w:r>
             <w:r>
               <w:rPr>
@@ -1601,7 +1608,7 @@
                 <w:noProof/>
                 <w:webHidden/>
               </w:rPr>
-              <w:instrText xml:space="preserve"> PAGEREF _Toc243725539 \h </w:instrText>
+              <w:instrText xml:space="preserve"> PAGEREF _Toc243734663 \h </w:instrText>
             </w:r>
             <w:r>
               <w:rPr>
@@ -1621,7 +1628,82 @@
                 <w:noProof/>
                 <w:webHidden/>
               </w:rPr>
-              <w:t>2</w:t>
+              <w:t>4</w:t>
+            </w:r>
+            <w:r>
+              <w:rPr>
+                <w:noProof/>
+                <w:webHidden/>
+              </w:rPr>
+              <w:fldChar w:fldCharType="end"/>
+            </w:r>
+          </w:hyperlink>
+        </w:p>
+        <w:p>
+          <w:pPr>
+            <w:pStyle w:val="Obsah2"/>
+            <w:tabs>
+              <w:tab w:val="right" w:leader="dot" w:pos="9984"/>
+            </w:tabs>
+            <w:rPr>
+              <w:rFonts w:asciiTheme="minorHAnsi" w:hAnsiTheme="minorHAnsi"/>
+              <w:noProof/>
+              <w:color w:val="auto"/>
+              <w:kern w:val="2"/>
+              <w:sz w:val="24"/>
+              <w:szCs w:val="24"/>
+              <w:lang w:val="cs-CZ" w:eastAsia="cs-CZ"/>
+              <w14:ligatures w14:val="standardContextual"/>
+            </w:rPr>
+          </w:pPr>
+          <w:hyperlink w:anchor="_Toc243734664" w:history="1">
+            <w:r>
+              <w:rPr>
+                <w:rStyle w:val="Hypertextovodkaz"/>
+                <w:noProof/>
+              </w:rPr>
+              <w:t>Rozsah funkcí</w:t>
+            </w:r>
+            <w:r>
+              <w:rPr>
+                <w:noProof/>
+                <w:webHidden/>
+              </w:rPr>
+              <w:tab/>
+            </w:r>
+            <w:r>
+              <w:rPr>
+                <w:noProof/>
+                <w:webHidden/>
+              </w:rPr>
+              <w:fldChar w:fldCharType="begin"/>
+            </w:r>
+            <w:r>
+              <w:rPr>
+                <w:noProof/>
+                <w:webHidden/>
+              </w:rPr>
+              <w:instrText xml:space="preserve"> PAGEREF _Toc243734664 \h </w:instrText>
+            </w:r>
+            <w:r>
+              <w:rPr>
+                <w:noProof/>
+                <w:webHidden/>
+              </w:rPr>
+            </w:r>
+            <w:r>
+              <w:rPr>
+                <w:noProof/>
+                <w:webHidden/>
+              </w:rPr>
+              <w:fldChar w:fldCharType="separate"/>
+            </w:r>
+            <w:r>
+              <w:rPr>
+                <w:noProof/>
+                <w:webHidden/>
+              </w:rPr>
+              <w:t>4</w:t>
             </w:r>
             <w:r>
               <w:rPr>
@@ -1639,16 +1721,23 @@
               <w:tab w:val="right" w:leader="dot" w:pos="9984"/>
             </w:tabs>
             <w:rPr>
+              <w:rFonts w:asciiTheme="minorHAnsi" w:hAnsiTheme="minorHAnsi"/>
               <w:noProof/>
+              <w:color w:val="auto"/>
+              <w:kern w:val="2"/>
+              <w:sz w:val="24"/>
+              <w:szCs w:val="24"/>
+              <w:lang w:val="cs-CZ" w:eastAsia="cs-CZ"/>
+              <w14:ligatures w14:val="standardContextual"/>
             </w:rPr>
           </w:pPr>
-          <w:hyperlink w:anchor="_Toc243725540" w:history="1">
+          <w:hyperlink w:anchor="_Toc243734665" w:history="1">
             <w:r>
               <w:rPr>
                 <w:rStyle w:val="Hypertextovodkaz"/>
                 <w:noProof/>
               </w:rPr>
-              <w:t>1 Přehled projektu</w:t>
+              <w:t>2 Architektura a tok programu</w:t>
             </w:r>
             <w:r>
               <w:rPr>
@@ -1669,7 +1758,7 @@
                 <w:noProof/>
                 <w:webHidden/>
               </w:rPr>
-              <w:instrText xml:space="preserve"> PAGEREF _Toc243725540 \h </w:instrText>
+              <w:instrText xml:space="preserve"> PAGEREF _Toc243734665 \h </w:instrText>
             </w:r>
             <w:r>
               <w:rPr>
@@ -1689,7 +1778,7 @@
                 <w:noProof/>
                 <w:webHidden/>
               </w:rPr>
-              <w:t>3</w:t>
+              <w:t>4</w:t>
             </w:r>
             <w:r>
               <w:rPr>
@@ -1707,16 +1796,23 @@
               <w:tab w:val="right" w:leader="dot" w:pos="9984"/>
             </w:tabs>
             <w:rPr>
+              <w:rFonts w:asciiTheme="minorHAnsi" w:hAnsiTheme="minorHAnsi"/>
               <w:noProof/>
+              <w:color w:val="auto"/>
+              <w:kern w:val="2"/>
+              <w:sz w:val="24"/>
+              <w:szCs w:val="24"/>
+              <w:lang w:val="cs-CZ" w:eastAsia="cs-CZ"/>
+              <w14:ligatures w14:val="standardContextual"/>
             </w:rPr>
           </w:pPr>
-          <w:hyperlink w:anchor="_Toc243725541" w:history="1">
+          <w:hyperlink w:anchor="_Toc243734666" w:history="1">
             <w:r>
               <w:rPr>
                 <w:rStyle w:val="Hypertextovodkaz"/>
                 <w:noProof/>
               </w:rPr>
-              <w:t>Rozsah funkcí</w:t>
+              <w:t>Průběh běhu</w:t>
             </w:r>
             <w:r>
               <w:rPr>
@@ -1737,7 +1833,7 @@
                 <w:noProof/>
                 <w:webHidden/>
               </w:rPr>
-              <w:instrText xml:space="preserve"> PAGEREF _Toc243725541 \h </w:instrText>
+              <w:instrText xml:space="preserve"> PAGEREF _Toc243734666 \h </w:instrText>
             </w:r>
             <w:r>
               <w:rPr>
@@ -1757,7 +1853,7 @@
                 <w:noProof/>
                 <w:webHidden/>
               </w:rPr>
-              <w:t>3</w:t>
+              <w:t>4</w:t>
             </w:r>
             <w:r>
               <w:rPr>
@@ -1775,16 +1871,23 @@
               <w:tab w:val="right" w:leader="dot" w:pos="9984"/>
             </w:tabs>
             <w:rPr>
+              <w:rFonts w:asciiTheme="minorHAnsi" w:hAnsiTheme="minorHAnsi"/>
               <w:noProof/>
+              <w:color w:val="auto"/>
+              <w:kern w:val="2"/>
+              <w:sz w:val="24"/>
+              <w:szCs w:val="24"/>
+              <w:lang w:val="cs-CZ" w:eastAsia="cs-CZ"/>
+              <w14:ligatures w14:val="standardContextual"/>
             </w:rPr>
           </w:pPr>
-          <w:hyperlink w:anchor="_Toc243725542" w:history="1">
+          <w:hyperlink w:anchor="_Toc243734667" w:history="1">
             <w:r>
               <w:rPr>
                 <w:rStyle w:val="Hypertextovodkaz"/>
                 <w:noProof/>
               </w:rPr>
-              <w:t>2 Architektura a tok programu</w:t>
+              <w:t>3 Struktura projektu</w:t>
             </w:r>
             <w:r>
               <w:rPr>
@@ -1805,7 +1908,7 @@
                 <w:noProof/>
                 <w:webHidden/>
               </w:rPr>
-              <w:instrText xml:space="preserve"> PAGEREF _Toc243725542 \h </w:instrText>
+              <w:instrText xml:space="preserve"> PAGEREF _Toc243734667 \h </w:instrText>
             </w:r>
             <w:r>
               <w:rPr>
@@ -1825,7 +1928,7 @@
                 <w:noProof/>
                 <w:webHidden/>
               </w:rPr>
-              <w:t>3</w:t>
+              <w:t>4</w:t>
             </w:r>
             <w:r>
               <w:rPr>
@@ -1843,16 +1946,23 @@
               <w:tab w:val="right" w:leader="dot" w:pos="9984"/>
             </w:tabs>
             <w:rPr>
+              <w:rFonts w:asciiTheme="minorHAnsi" w:hAnsiTheme="minorHAnsi"/>
               <w:noProof/>
+              <w:color w:val="auto"/>
+              <w:kern w:val="2"/>
+              <w:sz w:val="24"/>
+              <w:szCs w:val="24"/>
+              <w:lang w:val="cs-CZ" w:eastAsia="cs-CZ"/>
+              <w14:ligatures w14:val="standardContextual"/>
             </w:rPr>
           </w:pPr>
-          <w:hyperlink w:anchor="_Toc243725543" w:history="1">
+          <w:hyperlink w:anchor="_Toc243734668" w:history="1">
             <w:r>
               <w:rPr>
                 <w:rStyle w:val="Hypertextovodkaz"/>
                 <w:noProof/>
               </w:rPr>
-              <w:t>Průběh běhu</w:t>
+              <w:t>Vstupní obrázky</w:t>
             </w:r>
             <w:r>
               <w:rPr>
@@ -1873,7 +1983,7 @@
                 <w:noProof/>
                 <w:webHidden/>
               </w:rPr>
-              <w:instrText xml:space="preserve"> PAGEREF _Toc243725543 \h </w:instrText>
+              <w:instrText xml:space="preserve"> PAGEREF _Toc243734668 \h </w:instrText>
             </w:r>
             <w:r>
               <w:rPr>
@@ -1893,7 +2003,7 @@
                 <w:noProof/>
                 <w:webHidden/>
               </w:rPr>
-              <w:t>3</w:t>
+              <w:t>5</w:t>
             </w:r>
             <w:r>
               <w:rPr>
@@ -1911,16 +2021,23 @@
               <w:tab w:val="right" w:leader="dot" w:pos="9984"/>
             </w:tabs>
             <w:rPr>
+              <w:rFonts w:asciiTheme="minorHAnsi" w:hAnsiTheme="minorHAnsi"/>
               <w:noProof/>
+              <w:color w:val="auto"/>
+              <w:kern w:val="2"/>
+              <w:sz w:val="24"/>
+              <w:szCs w:val="24"/>
+              <w:lang w:val="cs-CZ" w:eastAsia="cs-CZ"/>
+              <w14:ligatures w14:val="standardContextual"/>
             </w:rPr>
           </w:pPr>
-          <w:hyperlink w:anchor="_Toc243725544" w:history="1">
+          <w:hyperlink w:anchor="_Toc243734669" w:history="1">
             <w:r>
               <w:rPr>
                 <w:rStyle w:val="Hypertextovodkaz"/>
                 <w:noProof/>
               </w:rPr>
-              <w:t>3 Struktura projektu</w:t>
+              <w:t>4 Datový model</w:t>
             </w:r>
             <w:r>
               <w:rPr>
@@ -1941,7 +2058,7 @@
                 <w:noProof/>
                 <w:webHidden/>
               </w:rPr>
-              <w:instrText xml:space="preserve"> PAGEREF _Toc243725544 \h </w:instrText>
+              <w:instrText xml:space="preserve"> PAGEREF _Toc243734669 \h </w:instrText>
             </w:r>
             <w:r>
               <w:rPr>
@@ -1961,7 +2078,7 @@
                 <w:noProof/>
                 <w:webHidden/>
               </w:rPr>
-              <w:t>3</w:t>
+              <w:t>5</w:t>
             </w:r>
             <w:r>
               <w:rPr>
@@ -1979,16 +2096,23 @@
               <w:tab w:val="right" w:leader="dot" w:pos="9984"/>
             </w:tabs>
             <w:rPr>
+              <w:rFonts w:asciiTheme="minorHAnsi" w:hAnsiTheme="minorHAnsi"/>
               <w:noProof/>
+              <w:color w:val="auto"/>
+              <w:kern w:val="2"/>
+              <w:sz w:val="24"/>
+              <w:szCs w:val="24"/>
+              <w:lang w:val="cs-CZ" w:eastAsia="cs-CZ"/>
+              <w14:ligatures w14:val="standardContextual"/>
             </w:rPr>
           </w:pPr>
-          <w:hyperlink w:anchor="_Toc243725545" w:history="1">
+          <w:hyperlink w:anchor="_Toc243734670" w:history="1">
             <w:r>
               <w:rPr>
                 <w:rStyle w:val="Hypertextovodkaz"/>
                 <w:noProof/>
               </w:rPr>
-              <w:t>Vstupní obrázky</w:t>
+              <w:t>MazeTitle</w:t>
             </w:r>
             <w:r>
               <w:rPr>
@@ -2009,7 +2133,7 @@
                 <w:noProof/>
                 <w:webHidden/>
               </w:rPr>
-              <w:instrText xml:space="preserve"> PAGEREF _Toc243725545 \h </w:instrText>
+              <w:instrText xml:space="preserve"> PAGEREF _Toc243734670 \h </w:instrText>
             </w:r>
             <w:r>
               <w:rPr>
@@ -2029,7 +2153,157 @@
                 <w:noProof/>
                 <w:webHidden/>
               </w:rPr>
-              <w:t>4</w:t>
+              <w:t>5</w:t>
+            </w:r>
+            <w:r>
+              <w:rPr>
+                <w:noProof/>
+                <w:webHidden/>
+              </w:rPr>
+              <w:fldChar w:fldCharType="end"/>
+            </w:r>
+          </w:hyperlink>
+        </w:p>
+        <w:p>
+          <w:pPr>
+            <w:pStyle w:val="Obsah2"/>
+            <w:tabs>
+              <w:tab w:val="right" w:leader="dot" w:pos="9984"/>
+            </w:tabs>
+            <w:rPr>
+              <w:rFonts w:asciiTheme="minorHAnsi" w:hAnsiTheme="minorHAnsi"/>
+              <w:noProof/>
+              <w:color w:val="auto"/>
+              <w:kern w:val="2"/>
+              <w:sz w:val="24"/>
+              <w:szCs w:val="24"/>
+              <w:lang w:val="cs-CZ" w:eastAsia="cs-CZ"/>
+              <w14:ligatures w14:val="standardContextual"/>
+            </w:rPr>
+          </w:pPr>
+          <w:hyperlink w:anchor="_Toc243734671" w:history="1">
+            <w:r>
+              <w:rPr>
+                <w:rStyle w:val="Hypertextovodkaz"/>
+                <w:noProof/>
+              </w:rPr>
+              <w:t>MazeState</w:t>
+            </w:r>
+            <w:r>
+              <w:rPr>
+                <w:noProof/>
+                <w:webHidden/>
+              </w:rPr>
+              <w:tab/>
+            </w:r>
+            <w:r>
+              <w:rPr>
+                <w:noProof/>
+                <w:webHidden/>
+              </w:rPr>
+              <w:fldChar w:fldCharType="begin"/>
+            </w:r>
+            <w:r>
+              <w:rPr>
+                <w:noProof/>
+                <w:webHidden/>
+              </w:rPr>
+              <w:instrText xml:space="preserve"> PAGEREF _Toc243734671 \h </w:instrText>
+            </w:r>
+            <w:r>
+              <w:rPr>
+                <w:noProof/>
+                <w:webHidden/>
+              </w:rPr>
+            </w:r>
+            <w:r>
+              <w:rPr>
+                <w:noProof/>
+                <w:webHidden/>
+              </w:rPr>
+              <w:fldChar w:fldCharType="separate"/>
+            </w:r>
+            <w:r>
+              <w:rPr>
+                <w:noProof/>
+                <w:webHidden/>
+              </w:rPr>
+              <w:t>5</w:t>
+            </w:r>
+            <w:r>
+              <w:rPr>
+                <w:noProof/>
+                <w:webHidden/>
+              </w:rPr>
+              <w:fldChar w:fldCharType="end"/>
+            </w:r>
+          </w:hyperlink>
+        </w:p>
+        <w:p>
+          <w:pPr>
+            <w:pStyle w:val="Obsah2"/>
+            <w:tabs>
+              <w:tab w:val="right" w:leader="dot" w:pos="9984"/>
+            </w:tabs>
+            <w:rPr>
+              <w:rFonts w:asciiTheme="minorHAnsi" w:hAnsiTheme="minorHAnsi"/>
+              <w:noProof/>
+              <w:color w:val="auto"/>
+              <w:kern w:val="2"/>
+              <w:sz w:val="24"/>
+              <w:szCs w:val="24"/>
+              <w:lang w:val="cs-CZ" w:eastAsia="cs-CZ"/>
+              <w14:ligatures w14:val="standardContextual"/>
+            </w:rPr>
+          </w:pPr>
+          <w:hyperlink w:anchor="_Toc243734672" w:history="1">
+            <w:r>
+              <w:rPr>
+                <w:rStyle w:val="Hypertextovodkaz"/>
+                <w:noProof/>
+              </w:rPr>
+              <w:t>Orientation</w:t>
+            </w:r>
+            <w:r>
+              <w:rPr>
+                <w:noProof/>
+                <w:webHidden/>
+              </w:rPr>
+              <w:tab/>
+            </w:r>
+            <w:r>
+              <w:rPr>
+                <w:noProof/>
+                <w:webHidden/>
+              </w:rPr>
+              <w:fldChar w:fldCharType="begin"/>
+            </w:r>
+            <w:r>
+              <w:rPr>
+                <w:noProof/>
+                <w:webHidden/>
+              </w:rPr>
+              <w:instrText xml:space="preserve"> PAGEREF _Toc243734672 \h </w:instrText>
+            </w:r>
+            <w:r>
+              <w:rPr>
+                <w:noProof/>
+                <w:webHidden/>
+              </w:rPr>
+            </w:r>
+            <w:r>
+              <w:rPr>
+                <w:noProof/>
+                <w:webHidden/>
+              </w:rPr>
+              <w:fldChar w:fldCharType="separate"/>
+            </w:r>
+            <w:r>
+              <w:rPr>
+                <w:noProof/>
+                <w:webHidden/>
+              </w:rPr>
+              <w:t>5</w:t>
             </w:r>
             <w:r>
               <w:rPr>
@@ -2047,16 +2321,23 @@
               <w:tab w:val="right" w:leader="dot" w:pos="9984"/>
             </w:tabs>
             <w:rPr>
+              <w:rFonts w:asciiTheme="minorHAnsi" w:hAnsiTheme="minorHAnsi"/>
               <w:noProof/>
+              <w:color w:val="auto"/>
+              <w:kern w:val="2"/>
+              <w:sz w:val="24"/>
+              <w:szCs w:val="24"/>
+              <w:lang w:val="cs-CZ" w:eastAsia="cs-CZ"/>
+              <w14:ligatures w14:val="standardContextual"/>
             </w:rPr>
           </w:pPr>
-          <w:hyperlink w:anchor="_Toc243725546" w:history="1">
+          <w:hyperlink w:anchor="_Toc243734673" w:history="1">
             <w:r>
               <w:rPr>
                 <w:rStyle w:val="Hypertextovodkaz"/>
                 <w:noProof/>
               </w:rPr>
-              <w:t>4 Datový model</w:t>
+              <w:t>5 Třída Maze</w:t>
             </w:r>
             <w:r>
               <w:rPr>
@@ -2077,7 +2358,7 @@
                 <w:noProof/>
                 <w:webHidden/>
               </w:rPr>
-              <w:instrText xml:space="preserve"> PAGEREF _Toc243725546 \h </w:instrText>
+              <w:instrText xml:space="preserve"> PAGEREF _Toc243734673 \h </w:instrText>
             </w:r>
             <w:r>
               <w:rPr>
@@ -2097,7 +2378,7 @@
                 <w:noProof/>
                 <w:webHidden/>
               </w:rPr>
-              <w:t>4</w:t>
+              <w:t>6</w:t>
             </w:r>
             <w:r>
               <w:rPr>
@@ -2115,16 +2396,23 @@
               <w:tab w:val="right" w:leader="dot" w:pos="9984"/>
             </w:tabs>
             <w:rPr>
+              <w:rFonts w:asciiTheme="minorHAnsi" w:hAnsiTheme="minorHAnsi"/>
               <w:noProof/>
+              <w:color w:val="auto"/>
+              <w:kern w:val="2"/>
+              <w:sz w:val="24"/>
+              <w:szCs w:val="24"/>
+              <w:lang w:val="cs-CZ" w:eastAsia="cs-CZ"/>
+              <w14:ligatures w14:val="standardContextual"/>
             </w:rPr>
           </w:pPr>
-          <w:hyperlink w:anchor="_Toc243725547" w:history="1">
+          <w:hyperlink w:anchor="_Toc243734674" w:history="1">
             <w:r>
               <w:rPr>
                 <w:rStyle w:val="Hypertextovodkaz"/>
                 <w:noProof/>
               </w:rPr>
-              <w:t>MazeTitle</w:t>
+              <w:t>Načítání a sestavení mřížky</w:t>
             </w:r>
             <w:r>
               <w:rPr>
@@ -2145,7 +2433,7 @@
                 <w:noProof/>
                 <w:webHidden/>
               </w:rPr>
-              <w:instrText xml:space="preserve"> PAGEREF _Toc243725547 \h </w:instrText>
+              <w:instrText xml:space="preserve"> PAGEREF _Toc243734674 \h </w:instrText>
             </w:r>
             <w:r>
               <w:rPr>
@@ -2165,7 +2453,7 @@
                 <w:noProof/>
                 <w:webHidden/>
               </w:rPr>
-              <w:t>4</w:t>
+              <w:t>6</w:t>
             </w:r>
             <w:r>
               <w:rPr>
@@ -2183,16 +2471,23 @@
               <w:tab w:val="right" w:leader="dot" w:pos="9984"/>
             </w:tabs>
             <w:rPr>
+              <w:rFonts w:asciiTheme="minorHAnsi" w:hAnsiTheme="minorHAnsi"/>
               <w:noProof/>
+              <w:color w:val="auto"/>
+              <w:kern w:val="2"/>
+              <w:sz w:val="24"/>
+              <w:szCs w:val="24"/>
+              <w:lang w:val="cs-CZ" w:eastAsia="cs-CZ"/>
+              <w14:ligatures w14:val="standardContextual"/>
             </w:rPr>
           </w:pPr>
-          <w:hyperlink w:anchor="_Toc243725548" w:history="1">
+          <w:hyperlink w:anchor="_Toc243734675" w:history="1">
             <w:r>
               <w:rPr>
                 <w:rStyle w:val="Hypertextovodkaz"/>
                 <w:noProof/>
               </w:rPr>
-              <w:t>MazeState</w:t>
+              <w:t>Práce s průchodností</w:t>
             </w:r>
             <w:r>
               <w:rPr>
@@ -2213,7 +2508,7 @@
                 <w:noProof/>
                 <w:webHidden/>
               </w:rPr>
-              <w:instrText xml:space="preserve"> PAGEREF _Toc243725548 \h </w:instrText>
+              <w:instrText xml:space="preserve"> PAGEREF _Toc243734675 \h </w:instrText>
             </w:r>
             <w:r>
               <w:rPr>
@@ -2233,7 +2528,7 @@
                 <w:noProof/>
                 <w:webHidden/>
               </w:rPr>
-              <w:t>4</w:t>
+              <w:t>6</w:t>
             </w:r>
             <w:r>
               <w:rPr>
@@ -2251,16 +2546,23 @@
               <w:tab w:val="right" w:leader="dot" w:pos="9984"/>
             </w:tabs>
             <w:rPr>
+              <w:rFonts w:asciiTheme="minorHAnsi" w:hAnsiTheme="minorHAnsi"/>
               <w:noProof/>
+              <w:color w:val="auto"/>
+              <w:kern w:val="2"/>
+              <w:sz w:val="24"/>
+              <w:szCs w:val="24"/>
+              <w:lang w:val="cs-CZ" w:eastAsia="cs-CZ"/>
+              <w14:ligatures w14:val="standardContextual"/>
             </w:rPr>
           </w:pPr>
-          <w:hyperlink w:anchor="_Toc243725549" w:history="1">
+          <w:hyperlink w:anchor="_Toc243734676" w:history="1">
             <w:r>
               <w:rPr>
                 <w:rStyle w:val="Hypertextovodkaz"/>
                 <w:noProof/>
               </w:rPr>
-              <w:t>Orientation</w:t>
+              <w:t>Výstup a pomocné metody</w:t>
             </w:r>
             <w:r>
               <w:rPr>
@@ -2281,7 +2583,7 @@
                 <w:noProof/>
                 <w:webHidden/>
               </w:rPr>
-              <w:instrText xml:space="preserve"> PAGEREF _Toc243725549 \h </w:instrText>
+              <w:instrText xml:space="preserve"> PAGEREF _Toc243734676 \h </w:instrText>
             </w:r>
             <w:r>
               <w:rPr>
@@ -2301,7 +2603,7 @@
                 <w:noProof/>
                 <w:webHidden/>
               </w:rPr>
-              <w:t>4</w:t>
+              <w:t>6</w:t>
             </w:r>
             <w:r>
               <w:rPr>
@@ -2319,16 +2621,23 @@
               <w:tab w:val="right" w:leader="dot" w:pos="9984"/>
             </w:tabs>
             <w:rPr>
+              <w:rFonts w:asciiTheme="minorHAnsi" w:hAnsiTheme="minorHAnsi"/>
               <w:noProof/>
+              <w:color w:val="auto"/>
+              <w:kern w:val="2"/>
+              <w:sz w:val="24"/>
+              <w:szCs w:val="24"/>
+              <w:lang w:val="cs-CZ" w:eastAsia="cs-CZ"/>
+              <w14:ligatures w14:val="standardContextual"/>
             </w:rPr>
           </w:pPr>
-          <w:hyperlink w:anchor="_Toc243725550" w:history="1">
+          <w:hyperlink w:anchor="_Toc243734677" w:history="1">
             <w:r>
               <w:rPr>
                 <w:rStyle w:val="Hypertextovodkaz"/>
                 <w:noProof/>
               </w:rPr>
-              <w:t>5 Třída Maze</w:t>
+              <w:t>6 Vyhledávací algoritmus</w:t>
             </w:r>
             <w:r>
               <w:rPr>
@@ -2349,7 +2658,7 @@
                 <w:noProof/>
                 <w:webHidden/>
               </w:rPr>
-              <w:instrText xml:space="preserve"> PAGEREF _Toc243725550 \h </w:instrText>
+              <w:instrText xml:space="preserve"> PAGEREF _Toc243734677 \h </w:instrText>
             </w:r>
             <w:r>
               <w:rPr>
@@ -2369,7 +2678,7 @@
                 <w:noProof/>
                 <w:webHidden/>
               </w:rPr>
-              <w:t>5</w:t>
+              <w:t>7</w:t>
             </w:r>
             <w:r>
               <w:rPr>
@@ -2387,16 +2696,23 @@
               <w:tab w:val="right" w:leader="dot" w:pos="9984"/>
             </w:tabs>
             <w:rPr>
+              <w:rFonts w:asciiTheme="minorHAnsi" w:hAnsiTheme="minorHAnsi"/>
               <w:noProof/>
+              <w:color w:val="auto"/>
+              <w:kern w:val="2"/>
+              <w:sz w:val="24"/>
+              <w:szCs w:val="24"/>
+              <w:lang w:val="cs-CZ" w:eastAsia="cs-CZ"/>
+              <w14:ligatures w14:val="standardContextual"/>
             </w:rPr>
           </w:pPr>
-          <w:hyperlink w:anchor="_Toc243725551" w:history="1">
+          <w:hyperlink w:anchor="_Toc243734678" w:history="1">
             <w:r>
               <w:rPr>
                 <w:rStyle w:val="Hypertextovodkaz"/>
                 <w:noProof/>
               </w:rPr>
-              <w:t>Načítání a sestavení mřížky</w:t>
+              <w:t>AlgorithmA</w:t>
             </w:r>
             <w:r>
               <w:rPr>
@@ -2417,7 +2733,7 @@
                 <w:noProof/>
                 <w:webHidden/>
               </w:rPr>
-              <w:instrText xml:space="preserve"> PAGEREF _Toc243725551 \h </w:instrText>
+              <w:instrText xml:space="preserve"> PAGEREF _Toc243734678 \h </w:instrText>
             </w:r>
             <w:r>
               <w:rPr>
@@ -2437,7 +2753,82 @@
                 <w:noProof/>
                 <w:webHidden/>
               </w:rPr>
-              <w:t>5</w:t>
+              <w:t>7</w:t>
+            </w:r>
+            <w:r>
+              <w:rPr>
+                <w:noProof/>
+                <w:webHidden/>
+              </w:rPr>
+              <w:fldChar w:fldCharType="end"/>
+            </w:r>
+          </w:hyperlink>
+        </w:p>
+        <w:p>
+          <w:pPr>
+            <w:pStyle w:val="Obsah3"/>
+            <w:tabs>
+              <w:tab w:val="right" w:leader="dot" w:pos="9984"/>
+            </w:tabs>
+            <w:rPr>
+              <w:rFonts w:asciiTheme="minorHAnsi" w:hAnsiTheme="minorHAnsi"/>
+              <w:noProof/>
+              <w:color w:val="auto"/>
+              <w:kern w:val="2"/>
+              <w:sz w:val="24"/>
+              <w:szCs w:val="24"/>
+              <w:lang w:val="cs-CZ" w:eastAsia="cs-CZ"/>
+              <w14:ligatures w14:val="standardContextual"/>
+            </w:rPr>
+          </w:pPr>
+          <w:hyperlink w:anchor="_Toc243734679" w:history="1">
+            <w:r>
+              <w:rPr>
+                <w:rStyle w:val="Hypertextovodkaz"/>
+                <w:noProof/>
+              </w:rPr>
+              <w:t>SearchListener</w:t>
+            </w:r>
+            <w:r>
+              <w:rPr>
+                <w:noProof/>
+                <w:webHidden/>
+              </w:rPr>
+              <w:tab/>
+            </w:r>
+            <w:r>
+              <w:rPr>
+                <w:noProof/>
+                <w:webHidden/>
+              </w:rPr>
+              <w:fldChar w:fldCharType="begin"/>
+            </w:r>
+            <w:r>
+              <w:rPr>
+                <w:noProof/>
+                <w:webHidden/>
+              </w:rPr>
+              <w:instrText xml:space="preserve"> PAGEREF _Toc243734679 \h </w:instrText>
+            </w:r>
+            <w:r>
+              <w:rPr>
+                <w:noProof/>
+                <w:webHidden/>
+              </w:rPr>
+            </w:r>
+            <w:r>
+              <w:rPr>
+                <w:noProof/>
+                <w:webHidden/>
+              </w:rPr>
+              <w:fldChar w:fldCharType="separate"/>
+            </w:r>
+            <w:r>
+              <w:rPr>
+                <w:noProof/>
+                <w:webHidden/>
+              </w:rPr>
+              <w:t>7</w:t>
             </w:r>
             <w:r>
               <w:rPr>
@@ -2455,16 +2846,23 @@
               <w:tab w:val="right" w:leader="dot" w:pos="9984"/>
             </w:tabs>
             <w:rPr>
+              <w:rFonts w:asciiTheme="minorHAnsi" w:hAnsiTheme="minorHAnsi"/>
               <w:noProof/>
+              <w:color w:val="auto"/>
+              <w:kern w:val="2"/>
+              <w:sz w:val="24"/>
+              <w:szCs w:val="24"/>
+              <w:lang w:val="cs-CZ" w:eastAsia="cs-CZ"/>
+              <w14:ligatures w14:val="standardContextual"/>
             </w:rPr>
           </w:pPr>
-          <w:hyperlink w:anchor="_Toc243725552" w:history="1">
+          <w:hyperlink w:anchor="_Toc243734680" w:history="1">
             <w:r>
               <w:rPr>
                 <w:rStyle w:val="Hypertextovodkaz"/>
                 <w:noProof/>
               </w:rPr>
-              <w:t>Práce s průchodností</w:t>
+              <w:t>Sort</w:t>
             </w:r>
             <w:r>
               <w:rPr>
@@ -2485,7 +2883,7 @@
                 <w:noProof/>
                 <w:webHidden/>
               </w:rPr>
-              <w:instrText xml:space="preserve"> PAGEREF _Toc243725552 \h </w:instrText>
+              <w:instrText xml:space="preserve"> PAGEREF _Toc243734680 \h </w:instrText>
             </w:r>
             <w:r>
               <w:rPr>
@@ -2505,7 +2903,157 @@
                 <w:noProof/>
                 <w:webHidden/>
               </w:rPr>
-              <w:t>5</w:t>
+              <w:t>7</w:t>
+            </w:r>
+            <w:r>
+              <w:rPr>
+                <w:noProof/>
+                <w:webHidden/>
+              </w:rPr>
+              <w:fldChar w:fldCharType="end"/>
+            </w:r>
+          </w:hyperlink>
+        </w:p>
+        <w:p>
+          <w:pPr>
+            <w:pStyle w:val="Obsah1"/>
+            <w:tabs>
+              <w:tab w:val="right" w:leader="dot" w:pos="9984"/>
+            </w:tabs>
+            <w:rPr>
+              <w:rFonts w:asciiTheme="minorHAnsi" w:hAnsiTheme="minorHAnsi"/>
+              <w:noProof/>
+              <w:color w:val="auto"/>
+              <w:kern w:val="2"/>
+              <w:sz w:val="24"/>
+              <w:szCs w:val="24"/>
+              <w:lang w:val="cs-CZ" w:eastAsia="cs-CZ"/>
+              <w14:ligatures w14:val="standardContextual"/>
+            </w:rPr>
+          </w:pPr>
+          <w:hyperlink w:anchor="_Toc243734681" w:history="1">
+            <w:r>
+              <w:rPr>
+                <w:rStyle w:val="Hypertextovodkaz"/>
+                <w:noProof/>
+              </w:rPr>
+              <w:t>7 Uživatelské rozhraní MazeGui</w:t>
+            </w:r>
+            <w:r>
+              <w:rPr>
+                <w:noProof/>
+                <w:webHidden/>
+              </w:rPr>
+              <w:tab/>
+            </w:r>
+            <w:r>
+              <w:rPr>
+                <w:noProof/>
+                <w:webHidden/>
+              </w:rPr>
+              <w:fldChar w:fldCharType="begin"/>
+            </w:r>
+            <w:r>
+              <w:rPr>
+                <w:noProof/>
+                <w:webHidden/>
+              </w:rPr>
+              <w:instrText xml:space="preserve"> PAGEREF _Toc243734681 \h </w:instrText>
+            </w:r>
+            <w:r>
+              <w:rPr>
+                <w:noProof/>
+                <w:webHidden/>
+              </w:rPr>
+            </w:r>
+            <w:r>
+              <w:rPr>
+                <w:noProof/>
+                <w:webHidden/>
+              </w:rPr>
+              <w:fldChar w:fldCharType="separate"/>
+            </w:r>
+            <w:r>
+              <w:rPr>
+                <w:noProof/>
+                <w:webHidden/>
+              </w:rPr>
+              <w:t>7</w:t>
+            </w:r>
+            <w:r>
+              <w:rPr>
+                <w:noProof/>
+                <w:webHidden/>
+              </w:rPr>
+              <w:fldChar w:fldCharType="end"/>
+            </w:r>
+          </w:hyperlink>
+        </w:p>
+        <w:p>
+          <w:pPr>
+            <w:pStyle w:val="Obsah1"/>
+            <w:tabs>
+              <w:tab w:val="right" w:leader="dot" w:pos="9984"/>
+            </w:tabs>
+            <w:rPr>
+              <w:rFonts w:asciiTheme="minorHAnsi" w:hAnsiTheme="minorHAnsi"/>
+              <w:noProof/>
+              <w:color w:val="auto"/>
+              <w:kern w:val="2"/>
+              <w:sz w:val="24"/>
+              <w:szCs w:val="24"/>
+              <w:lang w:val="cs-CZ" w:eastAsia="cs-CZ"/>
+              <w14:ligatures w14:val="standardContextual"/>
+            </w:rPr>
+          </w:pPr>
+          <w:hyperlink w:anchor="_Toc243734682" w:history="1">
+            <w:r>
+              <w:rPr>
+                <w:rStyle w:val="Hypertextovodkaz"/>
+                <w:noProof/>
+              </w:rPr>
+              <w:t>8 Uživatelský postup</w:t>
+            </w:r>
+            <w:r>
+              <w:rPr>
+                <w:noProof/>
+                <w:webHidden/>
+              </w:rPr>
+              <w:tab/>
+            </w:r>
+            <w:r>
+              <w:rPr>
+                <w:noProof/>
+                <w:webHidden/>
+              </w:rPr>
+              <w:fldChar w:fldCharType="begin"/>
+            </w:r>
+            <w:r>
+              <w:rPr>
+                <w:noProof/>
+                <w:webHidden/>
+              </w:rPr>
+              <w:instrText xml:space="preserve"> PAGEREF _Toc243734682 \h </w:instrText>
+            </w:r>
+            <w:r>
+              <w:rPr>
+                <w:noProof/>
+                <w:webHidden/>
+              </w:rPr>
+            </w:r>
+            <w:r>
+              <w:rPr>
+                <w:noProof/>
+                <w:webHidden/>
+              </w:rPr>
+              <w:fldChar w:fldCharType="separate"/>
+            </w:r>
+            <w:r>
+              <w:rPr>
+                <w:noProof/>
+                <w:webHidden/>
+              </w:rPr>
+              <w:t>8</w:t>
             </w:r>
             <w:r>
               <w:rPr>
@@ -2523,16 +3071,23 @@
               <w:tab w:val="right" w:leader="dot" w:pos="9984"/>
             </w:tabs>
             <w:rPr>
+              <w:rFonts w:asciiTheme="minorHAnsi" w:hAnsiTheme="minorHAnsi"/>
               <w:noProof/>
+              <w:color w:val="auto"/>
+              <w:kern w:val="2"/>
+              <w:sz w:val="24"/>
+              <w:szCs w:val="24"/>
+              <w:lang w:val="cs-CZ" w:eastAsia="cs-CZ"/>
+              <w14:ligatures w14:val="standardContextual"/>
             </w:rPr>
           </w:pPr>
-          <w:hyperlink w:anchor="_Toc243725553" w:history="1">
+          <w:hyperlink w:anchor="_Toc243734683" w:history="1">
             <w:r>
               <w:rPr>
                 <w:rStyle w:val="Hypertextovodkaz"/>
                 <w:noProof/>
               </w:rPr>
-              <w:t>Výstup a pomocné metody</w:t>
+              <w:t>Ovládací prvky a aktuální chování</w:t>
             </w:r>
             <w:r>
               <w:rPr>
@@ -2553,7 +3108,7 @@
                 <w:noProof/>
                 <w:webHidden/>
               </w:rPr>
-              <w:instrText xml:space="preserve"> PAGEREF _Toc243725553 \h </w:instrText>
+              <w:instrText xml:space="preserve"> PAGEREF _Toc243734683 \h </w:instrText>
             </w:r>
             <w:r>
               <w:rPr>
@@ -2573,7 +3128,7 @@
                 <w:noProof/>
                 <w:webHidden/>
               </w:rPr>
-              <w:t>5</w:t>
+              <w:t>8</w:t>
             </w:r>
             <w:r>
               <w:rPr>
@@ -2591,16 +3146,23 @@
               <w:tab w:val="right" w:leader="dot" w:pos="9984"/>
             </w:tabs>
             <w:rPr>
+              <w:rFonts w:asciiTheme="minorHAnsi" w:hAnsiTheme="minorHAnsi"/>
               <w:noProof/>
+              <w:color w:val="auto"/>
+              <w:kern w:val="2"/>
+              <w:sz w:val="24"/>
+              <w:szCs w:val="24"/>
+              <w:lang w:val="cs-CZ" w:eastAsia="cs-CZ"/>
+              <w14:ligatures w14:val="standardContextual"/>
             </w:rPr>
           </w:pPr>
-          <w:hyperlink w:anchor="_Toc243725554" w:history="1">
+          <w:hyperlink w:anchor="_Toc243734684" w:history="1">
             <w:r>
               <w:rPr>
                 <w:rStyle w:val="Hypertextovodkaz"/>
                 <w:noProof/>
               </w:rPr>
-              <w:t>6 Vyhledávací algoritmus</w:t>
+              <w:t>9 Sestavení a závislosti</w:t>
             </w:r>
             <w:r>
               <w:rPr>
@@ -2621,7 +3183,7 @@
                 <w:noProof/>
                 <w:webHidden/>
               </w:rPr>
-              <w:instrText xml:space="preserve"> PAGEREF _Toc243725554 \h </w:instrText>
+              <w:instrText xml:space="preserve"> PAGEREF _Toc243734684 \h </w:instrText>
             </w:r>
             <w:r>
               <w:rPr>
@@ -2641,7 +3203,308 @@
                 <w:noProof/>
                 <w:webHidden/>
               </w:rPr>
-              <w:t>6</w:t>
+              <w:t>8</w:t>
+            </w:r>
+            <w:r>
+              <w:rPr>
+                <w:noProof/>
+                <w:webHidden/>
+              </w:rPr>
+              <w:fldChar w:fldCharType="end"/>
+            </w:r>
+          </w:hyperlink>
+        </w:p>
+        <w:p>
+          <w:pPr>
+            <w:pStyle w:val="Obsah1"/>
+            <w:tabs>
+              <w:tab w:val="right" w:leader="dot" w:pos="9984"/>
+            </w:tabs>
+            <w:rPr>
+              <w:rFonts w:asciiTheme="minorHAnsi" w:hAnsiTheme="minorHAnsi"/>
+              <w:noProof/>
+              <w:color w:val="auto"/>
+              <w:kern w:val="2"/>
+              <w:sz w:val="24"/>
+              <w:szCs w:val="24"/>
+              <w:lang w:val="cs-CZ" w:eastAsia="cs-CZ"/>
+              <w14:ligatures w14:val="standardContextual"/>
+            </w:rPr>
+          </w:pPr>
+          <w:hyperlink w:anchor="_Toc243734685" w:history="1">
+            <w:r>
+              <w:rPr>
+                <w:rStyle w:val="Hypertextovodkaz"/>
+                <w:noProof/>
+              </w:rPr>
+              <w:t>10 Shrnutí tříd</w:t>
+            </w:r>
+            <w:r>
+              <w:rPr>
+                <w:noProof/>
+                <w:webHidden/>
+              </w:rPr>
+              <w:tab/>
+            </w:r>
+            <w:r>
+              <w:rPr>
+                <w:noProof/>
+                <w:webHidden/>
+              </w:rPr>
+              <w:fldChar w:fldCharType="begin"/>
+            </w:r>
+            <w:r>
+              <w:rPr>
+                <w:noProof/>
+                <w:webHidden/>
+              </w:rPr>
+              <w:instrText xml:space="preserve"> PAGEREF _Toc243734685 \h </w:instrText>
+            </w:r>
+            <w:r>
+              <w:rPr>
+                <w:noProof/>
+                <w:webHidden/>
+              </w:rPr>
+            </w:r>
+            <w:r>
+              <w:rPr>
+                <w:noProof/>
+                <w:webHidden/>
+              </w:rPr>
+              <w:fldChar w:fldCharType="separate"/>
+            </w:r>
+            <w:r>
+              <w:rPr>
+                <w:noProof/>
+                <w:webHidden/>
+              </w:rPr>
+              <w:t>9</w:t>
+            </w:r>
+            <w:r>
+              <w:rPr>
+                <w:noProof/>
+                <w:webHidden/>
+              </w:rPr>
+              <w:fldChar w:fldCharType="end"/>
+            </w:r>
+          </w:hyperlink>
+        </w:p>
+        <w:p>
+          <w:pPr>
+            <w:pStyle w:val="Obsah1"/>
+            <w:tabs>
+              <w:tab w:val="right" w:leader="dot" w:pos="9984"/>
+            </w:tabs>
+            <w:rPr>
+              <w:rFonts w:asciiTheme="minorHAnsi" w:hAnsiTheme="minorHAnsi"/>
+              <w:noProof/>
+              <w:color w:val="auto"/>
+              <w:kern w:val="2"/>
+              <w:sz w:val="24"/>
+              <w:szCs w:val="24"/>
+              <w:lang w:val="cs-CZ" w:eastAsia="cs-CZ"/>
+              <w14:ligatures w14:val="standardContextual"/>
+            </w:rPr>
+          </w:pPr>
+          <w:hyperlink w:anchor="_Toc243734686" w:history="1">
+            <w:r>
+              <w:rPr>
+                <w:rStyle w:val="Hypertextovodkaz"/>
+                <w:noProof/>
+              </w:rPr>
+              <w:t>11 Porovnání algoritmů</w:t>
+            </w:r>
+            <w:r>
+              <w:rPr>
+                <w:noProof/>
+                <w:webHidden/>
+              </w:rPr>
+              <w:tab/>
+            </w:r>
+            <w:r>
+              <w:rPr>
+                <w:noProof/>
+                <w:webHidden/>
+              </w:rPr>
+              <w:fldChar w:fldCharType="begin"/>
+            </w:r>
+            <w:r>
+              <w:rPr>
+                <w:noProof/>
+                <w:webHidden/>
+              </w:rPr>
+              <w:instrText xml:space="preserve"> PAGEREF _Toc243734686 \h </w:instrText>
+            </w:r>
+            <w:r>
+              <w:rPr>
+                <w:noProof/>
+                <w:webHidden/>
+              </w:rPr>
+            </w:r>
+            <w:r>
+              <w:rPr>
+                <w:noProof/>
+                <w:webHidden/>
+              </w:rPr>
+              <w:fldChar w:fldCharType="separate"/>
+            </w:r>
+            <w:r>
+              <w:rPr>
+                <w:noProof/>
+                <w:webHidden/>
+              </w:rPr>
+              <w:t>10</w:t>
+            </w:r>
+            <w:r>
+              <w:rPr>
+                <w:noProof/>
+                <w:webHidden/>
+              </w:rPr>
+              <w:fldChar w:fldCharType="end"/>
+            </w:r>
+          </w:hyperlink>
+        </w:p>
+        <w:p>
+          <w:pPr>
+            <w:pStyle w:val="Obsah1"/>
+            <w:tabs>
+              <w:tab w:val="right" w:leader="dot" w:pos="9984"/>
+            </w:tabs>
+            <w:rPr>
+              <w:rFonts w:asciiTheme="minorHAnsi" w:hAnsiTheme="minorHAnsi"/>
+              <w:noProof/>
+              <w:color w:val="auto"/>
+              <w:kern w:val="2"/>
+              <w:sz w:val="24"/>
+              <w:szCs w:val="24"/>
+              <w:lang w:val="cs-CZ" w:eastAsia="cs-CZ"/>
+              <w14:ligatures w14:val="standardContextual"/>
+            </w:rPr>
+          </w:pPr>
+          <w:hyperlink w:anchor="_Toc243734687" w:history="1">
+            <w:r>
+              <w:rPr>
+                <w:rStyle w:val="Hypertextovodkaz"/>
+                <w:noProof/>
+                <w:lang w:val="cs-CZ"/>
+              </w:rPr>
+              <w:t>12. Způsob rozpoznávání stěn a tolerance spektra</w:t>
+            </w:r>
+            <w:r>
+              <w:rPr>
+                <w:noProof/>
+                <w:webHidden/>
+              </w:rPr>
+              <w:tab/>
+            </w:r>
+            <w:r>
+              <w:rPr>
+                <w:noProof/>
+                <w:webHidden/>
+              </w:rPr>
+              <w:fldChar w:fldCharType="begin"/>
+            </w:r>
+            <w:r>
+              <w:rPr>
+                <w:noProof/>
+                <w:webHidden/>
+              </w:rPr>
+              <w:instrText xml:space="preserve"> PAGEREF _Toc243734687 \h </w:instrText>
+            </w:r>
+            <w:r>
+              <w:rPr>
+                <w:noProof/>
+                <w:webHidden/>
+              </w:rPr>
+            </w:r>
+            <w:r>
+              <w:rPr>
+                <w:noProof/>
+                <w:webHidden/>
+              </w:rPr>
+              <w:fldChar w:fldCharType="separate"/>
+            </w:r>
+            <w:r>
+              <w:rPr>
+                <w:noProof/>
+                <w:webHidden/>
+              </w:rPr>
+              <w:t>11</w:t>
+            </w:r>
+            <w:r>
+              <w:rPr>
+                <w:noProof/>
+                <w:webHidden/>
+              </w:rPr>
+              <w:fldChar w:fldCharType="end"/>
+            </w:r>
+          </w:hyperlink>
+        </w:p>
+        <w:p>
+          <w:pPr>
+            <w:pStyle w:val="Obsah1"/>
+            <w:tabs>
+              <w:tab w:val="right" w:leader="dot" w:pos="9984"/>
+            </w:tabs>
+            <w:rPr>
+              <w:rFonts w:asciiTheme="minorHAnsi" w:hAnsiTheme="minorHAnsi"/>
+              <w:noProof/>
+              <w:color w:val="auto"/>
+              <w:kern w:val="2"/>
+              <w:sz w:val="24"/>
+              <w:szCs w:val="24"/>
+              <w:lang w:val="cs-CZ" w:eastAsia="cs-CZ"/>
+              <w14:ligatures w14:val="standardContextual"/>
+            </w:rPr>
+          </w:pPr>
+          <w:hyperlink w:anchor="_Toc243734688" w:history="1">
+            <w:r>
+              <w:rPr>
+                <w:rStyle w:val="Hypertextovodkaz"/>
+                <w:noProof/>
+              </w:rPr>
+              <w:t>13 Experimenty</w:t>
+            </w:r>
+            <w:r>
+              <w:rPr>
+                <w:noProof/>
+                <w:webHidden/>
+              </w:rPr>
+              <w:tab/>
+            </w:r>
+            <w:r>
+              <w:rPr>
+                <w:noProof/>
+                <w:webHidden/>
+              </w:rPr>
+              <w:fldChar w:fldCharType="begin"/>
+            </w:r>
+            <w:r>
+              <w:rPr>
+                <w:noProof/>
+                <w:webHidden/>
+              </w:rPr>
+              <w:instrText xml:space="preserve"> PAGEREF _Toc243734688 \h </w:instrText>
+            </w:r>
+            <w:r>
+              <w:rPr>
+                <w:noProof/>
+                <w:webHidden/>
+              </w:rPr>
+            </w:r>
+            <w:r>
+              <w:rPr>
+                <w:noProof/>
+                <w:webHidden/>
+              </w:rPr>
+              <w:fldChar w:fldCharType="separate"/>
+            </w:r>
+            <w:r>
+              <w:rPr>
+                <w:noProof/>
+                <w:webHidden/>
+              </w:rPr>
+              <w:t>12</w:t>
             </w:r>
             <w:r>
               <w:rPr>
@@ -2659,16 +3522,23 @@
               <w:tab w:val="right" w:leader="dot" w:pos="9984"/>
             </w:tabs>
             <w:rPr>
+              <w:rFonts w:asciiTheme="minorHAnsi" w:hAnsiTheme="minorHAnsi"/>
               <w:noProof/>
+              <w:color w:val="auto"/>
+              <w:kern w:val="2"/>
+              <w:sz w:val="24"/>
+              <w:szCs w:val="24"/>
+              <w:lang w:val="cs-CZ" w:eastAsia="cs-CZ"/>
+              <w14:ligatures w14:val="standardContextual"/>
             </w:rPr>
           </w:pPr>
-          <w:hyperlink w:anchor="_Toc243725555" w:history="1">
+          <w:hyperlink w:anchor="_Toc243734689" w:history="1">
             <w:r>
               <w:rPr>
                 <w:rStyle w:val="Hypertextovodkaz"/>
                 <w:noProof/>
               </w:rPr>
-              <w:t>AlgorithmA</w:t>
+              <w:t>Exp.1</w:t>
             </w:r>
             <w:r>
               <w:rPr>
@@ -2689,7 +3559,7 @@
                 <w:noProof/>
                 <w:webHidden/>
               </w:rPr>
-              <w:instrText xml:space="preserve"> PAGEREF _Toc243725555 \h </w:instrText>
+              <w:instrText xml:space="preserve"> PAGEREF _Toc243734689 \h </w:instrText>
             </w:r>
             <w:r>
               <w:rPr>
@@ -2709,75 +3579,7 @@
                 <w:noProof/>
                 <w:webHidden/>
               </w:rPr>
-              <w:t>6</w:t>
-            </w:r>
-            <w:r>
-              <w:rPr>
-                <w:noProof/>
-                <w:webHidden/>
-              </w:rPr>
-              <w:fldChar w:fldCharType="end"/>
-            </w:r>
-          </w:hyperlink>
-        </w:p>
-        <w:p>
-          <w:pPr>
-            <w:pStyle w:val="Obsah3"/>
-            <w:tabs>
-              <w:tab w:val="right" w:leader="dot" w:pos="9984"/>
-            </w:tabs>
-            <w:rPr>
-              <w:noProof/>
-            </w:rPr>
-          </w:pPr>
-          <w:hyperlink w:anchor="_Toc243725556" w:history="1">
-            <w:r>
-              <w:rPr>
-                <w:rStyle w:val="Hypertextovodkaz"/>
-                <w:noProof/>
-              </w:rPr>
-              <w:t>SearchListener</w:t>
-            </w:r>
-            <w:r>
-              <w:rPr>
-                <w:noProof/>
-                <w:webHidden/>
-              </w:rPr>
-              <w:tab/>
-            </w:r>
-            <w:r>
-              <w:rPr>
-                <w:noProof/>
-                <w:webHidden/>
-              </w:rPr>
-              <w:fldChar w:fldCharType="begin"/>
-            </w:r>
-            <w:r>
-              <w:rPr>
-                <w:noProof/>
-                <w:webHidden/>
-              </w:rPr>
-              <w:instrText xml:space="preserve"> PAGEREF _Toc243725556 \h </w:instrText>
-            </w:r>
-            <w:r>
-              <w:rPr>
-                <w:noProof/>
-                <w:webHidden/>
-              </w:rPr>
-            </w:r>
-            <w:r>
-              <w:rPr>
-                <w:noProof/>
-                <w:webHidden/>
-              </w:rPr>
-              <w:fldChar w:fldCharType="separate"/>
-            </w:r>
-            <w:r>
-              <w:rPr>
-                <w:noProof/>
-                <w:webHidden/>
-              </w:rPr>
-              <w:t>6</w:t>
+              <w:t>12</w:t>
             </w:r>
             <w:r>
               <w:rPr>
@@ -2795,16 +3597,23 @@
               <w:tab w:val="right" w:leader="dot" w:pos="9984"/>
             </w:tabs>
             <w:rPr>
+              <w:rFonts w:asciiTheme="minorHAnsi" w:hAnsiTheme="minorHAnsi"/>
               <w:noProof/>
+              <w:color w:val="auto"/>
+              <w:kern w:val="2"/>
+              <w:sz w:val="24"/>
+              <w:szCs w:val="24"/>
+              <w:lang w:val="cs-CZ" w:eastAsia="cs-CZ"/>
+              <w14:ligatures w14:val="standardContextual"/>
             </w:rPr>
           </w:pPr>
-          <w:hyperlink w:anchor="_Toc243725557" w:history="1">
+          <w:hyperlink w:anchor="_Toc243734690" w:history="1">
             <w:r>
               <w:rPr>
                 <w:rStyle w:val="Hypertextovodkaz"/>
                 <w:noProof/>
               </w:rPr>
-              <w:t>Sort</w:t>
+              <w:t>Exp.2</w:t>
             </w:r>
             <w:r>
               <w:rPr>
@@ -2825,7 +3634,7 @@
                 <w:noProof/>
                 <w:webHidden/>
               </w:rPr>
-              <w:instrText xml:space="preserve"> PAGEREF _Toc243725557 \h </w:instrText>
+              <w:instrText xml:space="preserve"> PAGEREF _Toc243734690 \h </w:instrText>
             </w:r>
             <w:r>
               <w:rPr>
@@ -2845,143 +3654,7 @@
                 <w:noProof/>
                 <w:webHidden/>
               </w:rPr>
-              <w:t>6</w:t>
-            </w:r>
-            <w:r>
-              <w:rPr>
-                <w:noProof/>
-                <w:webHidden/>
-              </w:rPr>
-              <w:fldChar w:fldCharType="end"/>
-            </w:r>
-          </w:hyperlink>
-        </w:p>
-        <w:p>
-          <w:pPr>
-            <w:pStyle w:val="Obsah1"/>
-            <w:tabs>
-              <w:tab w:val="right" w:leader="dot" w:pos="9984"/>
-            </w:tabs>
-            <w:rPr>
-              <w:noProof/>
-            </w:rPr>
-          </w:pPr>
-          <w:hyperlink w:anchor="_Toc243725558" w:history="1">
-            <w:r>
-              <w:rPr>
-                <w:rStyle w:val="Hypertextovodkaz"/>
-                <w:noProof/>
-              </w:rPr>
-              <w:t>7 Uživatelské rozhraní MazeGui</w:t>
-            </w:r>
-            <w:r>
-              <w:rPr>
-                <w:noProof/>
-                <w:webHidden/>
-              </w:rPr>
-              <w:tab/>
-            </w:r>
-            <w:r>
-              <w:rPr>
-                <w:noProof/>
-                <w:webHidden/>
-              </w:rPr>
-              <w:fldChar w:fldCharType="begin"/>
-            </w:r>
-            <w:r>
-              <w:rPr>
-                <w:noProof/>
-                <w:webHidden/>
-              </w:rPr>
-              <w:instrText xml:space="preserve"> PAGEREF _Toc243725558 \h </w:instrText>
-            </w:r>
-            <w:r>
-              <w:rPr>
-                <w:noProof/>
-                <w:webHidden/>
-              </w:rPr>
-            </w:r>
-            <w:r>
-              <w:rPr>
-                <w:noProof/>
-                <w:webHidden/>
-              </w:rPr>
-              <w:fldChar w:fldCharType="separate"/>
-            </w:r>
-            <w:r>
-              <w:rPr>
-                <w:noProof/>
-                <w:webHidden/>
-              </w:rPr>
-              <w:t>6</w:t>
-            </w:r>
-            <w:r>
-              <w:rPr>
-                <w:noProof/>
-                <w:webHidden/>
-              </w:rPr>
-              <w:fldChar w:fldCharType="end"/>
-            </w:r>
-          </w:hyperlink>
-        </w:p>
-        <w:p>
-          <w:pPr>
-            <w:pStyle w:val="Obsah1"/>
-            <w:tabs>
-              <w:tab w:val="right" w:leader="dot" w:pos="9984"/>
-            </w:tabs>
-            <w:rPr>
-              <w:noProof/>
-            </w:rPr>
-          </w:pPr>
-          <w:hyperlink w:anchor="_Toc243725559" w:history="1">
-            <w:r>
-              <w:rPr>
-                <w:rStyle w:val="Hypertextovodkaz"/>
-                <w:noProof/>
-              </w:rPr>
-              <w:t>8 Uživatelský postup</w:t>
-            </w:r>
-            <w:r>
-              <w:rPr>
-                <w:noProof/>
-                <w:webHidden/>
-              </w:rPr>
-              <w:tab/>
-            </w:r>
-            <w:r>
-              <w:rPr>
-                <w:noProof/>
-                <w:webHidden/>
-              </w:rPr>
-              <w:fldChar w:fldCharType="begin"/>
-            </w:r>
-            <w:r>
-              <w:rPr>
-                <w:noProof/>
-                <w:webHidden/>
-              </w:rPr>
-              <w:instrText xml:space="preserve"> PAGEREF _Toc243725559 \h </w:instrText>
-            </w:r>
-            <w:r>
-              <w:rPr>
-                <w:noProof/>
-                <w:webHidden/>
-              </w:rPr>
-            </w:r>
-            <w:r>
-              <w:rPr>
-                <w:noProof/>
-                <w:webHidden/>
-              </w:rPr>
-              <w:fldChar w:fldCharType="separate"/>
-            </w:r>
-            <w:r>
-              <w:rPr>
-                <w:noProof/>
-                <w:webHidden/>
-              </w:rPr>
-              <w:t>7</w:t>
+              <w:t>13</w:t>
             </w:r>
             <w:r>
               <w:rPr>
@@ -2999,16 +3672,23 @@
               <w:tab w:val="right" w:leader="dot" w:pos="9984"/>
             </w:tabs>
             <w:rPr>
+              <w:rFonts w:asciiTheme="minorHAnsi" w:hAnsiTheme="minorHAnsi"/>
               <w:noProof/>
+              <w:color w:val="auto"/>
+              <w:kern w:val="2"/>
+              <w:sz w:val="24"/>
+              <w:szCs w:val="24"/>
+              <w:lang w:val="cs-CZ" w:eastAsia="cs-CZ"/>
+              <w14:ligatures w14:val="standardContextual"/>
             </w:rPr>
           </w:pPr>
-          <w:hyperlink w:anchor="_Toc243725560" w:history="1">
+          <w:hyperlink w:anchor="_Toc243734691" w:history="1">
             <w:r>
               <w:rPr>
                 <w:rStyle w:val="Hypertextovodkaz"/>
                 <w:noProof/>
               </w:rPr>
-              <w:t>Ovládací prvky a aktuální chování</w:t>
+              <w:t>Exp.3</w:t>
             </w:r>
             <w:r>
               <w:rPr>
@@ -3029,7 +3709,7 @@
                 <w:noProof/>
                 <w:webHidden/>
               </w:rPr>
-              <w:instrText xml:space="preserve"> PAGEREF _Toc243725560 \h </w:instrText>
+              <w:instrText xml:space="preserve"> PAGEREF _Toc243734691 \h </w:instrText>
             </w:r>
             <w:r>
               <w:rPr>
@@ -3049,143 +3729,7 @@
                 <w:noProof/>
                 <w:webHidden/>
               </w:rPr>
-              <w:t>7</w:t>
-            </w:r>
-            <w:r>
-              <w:rPr>
-                <w:noProof/>
-                <w:webHidden/>
-              </w:rPr>
-              <w:fldChar w:fldCharType="end"/>
-            </w:r>
-          </w:hyperlink>
-        </w:p>
-        <w:p>
-          <w:pPr>
-            <w:pStyle w:val="Obsah1"/>
-            <w:tabs>
-              <w:tab w:val="right" w:leader="dot" w:pos="9984"/>
-            </w:tabs>
-            <w:rPr>
-              <w:noProof/>
-            </w:rPr>
-          </w:pPr>
-          <w:hyperlink w:anchor="_Toc243725561" w:history="1">
-            <w:r>
-              <w:rPr>
-                <w:rStyle w:val="Hypertextovodkaz"/>
-                <w:noProof/>
-              </w:rPr>
-              <w:t>9 Sestavení a závislosti</w:t>
-            </w:r>
-            <w:r>
-              <w:rPr>
-                <w:noProof/>
-                <w:webHidden/>
-              </w:rPr>
-              <w:tab/>
-            </w:r>
-            <w:r>
-              <w:rPr>
-                <w:noProof/>
-                <w:webHidden/>
-              </w:rPr>
-              <w:fldChar w:fldCharType="begin"/>
-            </w:r>
-            <w:r>
-              <w:rPr>
-                <w:noProof/>
-                <w:webHidden/>
-              </w:rPr>
-              <w:instrText xml:space="preserve"> PAGEREF _Toc243725561 \h </w:instrText>
-            </w:r>
-            <w:r>
-              <w:rPr>
-                <w:noProof/>
-                <w:webHidden/>
-              </w:rPr>
-            </w:r>
-            <w:r>
-              <w:rPr>
-                <w:noProof/>
-                <w:webHidden/>
-              </w:rPr>
-              <w:fldChar w:fldCharType="separate"/>
-            </w:r>
-            <w:r>
-              <w:rPr>
-                <w:noProof/>
-                <w:webHidden/>
-              </w:rPr>
-              <w:t>7</w:t>
-            </w:r>
-            <w:r>
-              <w:rPr>
-                <w:noProof/>
-                <w:webHidden/>
-              </w:rPr>
-              <w:fldChar w:fldCharType="end"/>
-            </w:r>
-          </w:hyperlink>
-        </w:p>
-        <w:p>
-          <w:pPr>
-            <w:pStyle w:val="Obsah1"/>
-            <w:tabs>
-              <w:tab w:val="right" w:leader="dot" w:pos="9984"/>
-            </w:tabs>
-            <w:rPr>
-              <w:noProof/>
-            </w:rPr>
-          </w:pPr>
-          <w:hyperlink w:anchor="_Toc243725562" w:history="1">
-            <w:r>
-              <w:rPr>
-                <w:rStyle w:val="Hypertextovodkaz"/>
-                <w:noProof/>
-              </w:rPr>
-              <w:t>10 Omezení a technická rizika</w:t>
-            </w:r>
-            <w:r>
-              <w:rPr>
-                <w:noProof/>
-                <w:webHidden/>
-              </w:rPr>
-              <w:tab/>
-            </w:r>
-            <w:r>
-              <w:rPr>
-                <w:noProof/>
-                <w:webHidden/>
-              </w:rPr>
-              <w:fldChar w:fldCharType="begin"/>
-            </w:r>
-            <w:r>
-              <w:rPr>
-                <w:noProof/>
-                <w:webHidden/>
-              </w:rPr>
-              <w:instrText xml:space="preserve"> PAGEREF _Toc243725562 \h </w:instrText>
-            </w:r>
-            <w:r>
-              <w:rPr>
-                <w:noProof/>
-                <w:webHidden/>
-              </w:rPr>
-            </w:r>
-            <w:r>
-              <w:rPr>
-                <w:noProof/>
-                <w:webHidden/>
-              </w:rPr>
-              <w:fldChar w:fldCharType="separate"/>
-            </w:r>
-            <w:r>
-              <w:rPr>
-                <w:noProof/>
-                <w:webHidden/>
-              </w:rPr>
-              <w:t>8</w:t>
+              <w:t>14</w:t>
             </w:r>
             <w:r>
               <w:rPr>
@@ -3203,16 +3747,23 @@
               <w:tab w:val="right" w:leader="dot" w:pos="9984"/>
             </w:tabs>
             <w:rPr>
+              <w:rFonts w:asciiTheme="minorHAnsi" w:hAnsiTheme="minorHAnsi"/>
               <w:noProof/>
+              <w:color w:val="auto"/>
+              <w:kern w:val="2"/>
+              <w:sz w:val="24"/>
+              <w:szCs w:val="24"/>
+              <w:lang w:val="cs-CZ" w:eastAsia="cs-CZ"/>
+              <w14:ligatures w14:val="standardContextual"/>
             </w:rPr>
           </w:pPr>
-          <w:hyperlink w:anchor="_Toc243725563" w:history="1">
+          <w:hyperlink w:anchor="_Toc243734692" w:history="1">
             <w:r>
               <w:rPr>
                 <w:rStyle w:val="Hypertextovodkaz"/>
                 <w:noProof/>
               </w:rPr>
-              <w:t>Doporučené další kroky</w:t>
+              <w:t>Exp.4</w:t>
             </w:r>
             <w:r>
               <w:rPr>
@@ -3233,7 +3784,7 @@
                 <w:noProof/>
                 <w:webHidden/>
               </w:rPr>
-              <w:instrText xml:space="preserve"> PAGEREF _Toc243725563 \h </w:instrText>
+              <w:instrText xml:space="preserve"> PAGEREF _Toc243734692 \h </w:instrText>
             </w:r>
             <w:r>
               <w:rPr>
@@ -3253,7 +3804,7 @@
                 <w:noProof/>
                 <w:webHidden/>
               </w:rPr>
-              <w:t>8</w:t>
+              <w:t>15</w:t>
             </w:r>
             <w:r>
               <w:rPr>
@@ -3266,21 +3817,28 @@
         </w:p>
         <w:p>
           <w:pPr>
-            <w:pStyle w:val="Obsah1"/>
+            <w:pStyle w:val="Obsah2"/>
             <w:tabs>
               <w:tab w:val="right" w:leader="dot" w:pos="9984"/>
             </w:tabs>
             <w:rPr>
+              <w:rFonts w:asciiTheme="minorHAnsi" w:hAnsiTheme="minorHAnsi"/>
               <w:noProof/>
+              <w:color w:val="auto"/>
+              <w:kern w:val="2"/>
+              <w:sz w:val="24"/>
+              <w:szCs w:val="24"/>
+              <w:lang w:val="cs-CZ" w:eastAsia="cs-CZ"/>
+              <w14:ligatures w14:val="standardContextual"/>
             </w:rPr>
           </w:pPr>
-          <w:hyperlink w:anchor="_Toc243725564" w:history="1">
+          <w:hyperlink w:anchor="_Toc243734693" w:history="1">
             <w:r>
               <w:rPr>
                 <w:rStyle w:val="Hypertextovodkaz"/>
                 <w:noProof/>
               </w:rPr>
-              <w:t>11 Shrnutí tříd</w:t>
+              <w:t>Exp.5</w:t>
             </w:r>
             <w:r>
               <w:rPr>
@@ -3301,7 +3859,7 @@
                 <w:noProof/>
                 <w:webHidden/>
               </w:rPr>
-              <w:instrText xml:space="preserve"> PAGEREF _Toc243725564 \h </w:instrText>
+              <w:instrText xml:space="preserve"> PAGEREF _Toc243734693 \h </w:instrText>
             </w:r>
             <w:r>
               <w:rPr>
@@ -3321,7 +3879,607 @@
                 <w:noProof/>
                 <w:webHidden/>
               </w:rPr>
-              <w:t>8</w:t>
+              <w:t>16</w:t>
+            </w:r>
+            <w:r>
+              <w:rPr>
+                <w:noProof/>
+                <w:webHidden/>
+              </w:rPr>
+              <w:fldChar w:fldCharType="end"/>
+            </w:r>
+          </w:hyperlink>
+        </w:p>
+        <w:p>
+          <w:pPr>
+            <w:pStyle w:val="Obsah2"/>
+            <w:tabs>
+              <w:tab w:val="right" w:leader="dot" w:pos="9984"/>
+            </w:tabs>
+            <w:rPr>
+              <w:rFonts w:asciiTheme="minorHAnsi" w:hAnsiTheme="minorHAnsi"/>
+              <w:noProof/>
+              <w:color w:val="auto"/>
+              <w:kern w:val="2"/>
+              <w:sz w:val="24"/>
+              <w:szCs w:val="24"/>
+              <w:lang w:val="cs-CZ" w:eastAsia="cs-CZ"/>
+              <w14:ligatures w14:val="standardContextual"/>
+            </w:rPr>
+          </w:pPr>
+          <w:hyperlink w:anchor="_Toc243734694" w:history="1">
+            <w:r>
+              <w:rPr>
+                <w:rStyle w:val="Hypertextovodkaz"/>
+                <w:noProof/>
+              </w:rPr>
+              <w:t>Exp.6</w:t>
+            </w:r>
+            <w:r>
+              <w:rPr>
+                <w:noProof/>
+                <w:webHidden/>
+              </w:rPr>
+              <w:tab/>
+            </w:r>
+            <w:r>
+              <w:rPr>
+                <w:noProof/>
+                <w:webHidden/>
+              </w:rPr>
+              <w:fldChar w:fldCharType="begin"/>
+            </w:r>
+            <w:r>
+              <w:rPr>
+                <w:noProof/>
+                <w:webHidden/>
+              </w:rPr>
+              <w:instrText xml:space="preserve"> PAGEREF _Toc243734694 \h </w:instrText>
+            </w:r>
+            <w:r>
+              <w:rPr>
+                <w:noProof/>
+                <w:webHidden/>
+              </w:rPr>
+            </w:r>
+            <w:r>
+              <w:rPr>
+                <w:noProof/>
+                <w:webHidden/>
+              </w:rPr>
+              <w:fldChar w:fldCharType="separate"/>
+            </w:r>
+            <w:r>
+              <w:rPr>
+                <w:noProof/>
+                <w:webHidden/>
+              </w:rPr>
+              <w:t>17</w:t>
+            </w:r>
+            <w:r>
+              <w:rPr>
+                <w:noProof/>
+                <w:webHidden/>
+              </w:rPr>
+              <w:fldChar w:fldCharType="end"/>
+            </w:r>
+          </w:hyperlink>
+        </w:p>
+        <w:p>
+          <w:pPr>
+            <w:pStyle w:val="Obsah2"/>
+            <w:tabs>
+              <w:tab w:val="right" w:leader="dot" w:pos="9984"/>
+            </w:tabs>
+            <w:rPr>
+              <w:rFonts w:asciiTheme="minorHAnsi" w:hAnsiTheme="minorHAnsi"/>
+              <w:noProof/>
+              <w:color w:val="auto"/>
+              <w:kern w:val="2"/>
+              <w:sz w:val="24"/>
+              <w:szCs w:val="24"/>
+              <w:lang w:val="cs-CZ" w:eastAsia="cs-CZ"/>
+              <w14:ligatures w14:val="standardContextual"/>
+            </w:rPr>
+          </w:pPr>
+          <w:hyperlink w:anchor="_Toc243734695" w:history="1">
+            <w:r>
+              <w:rPr>
+                <w:rStyle w:val="Hypertextovodkaz"/>
+                <w:noProof/>
+              </w:rPr>
+              <w:t>Exp.7</w:t>
+            </w:r>
+            <w:r>
+              <w:rPr>
+                <w:noProof/>
+                <w:webHidden/>
+              </w:rPr>
+              <w:tab/>
+            </w:r>
+            <w:r>
+              <w:rPr>
+                <w:noProof/>
+                <w:webHidden/>
+              </w:rPr>
+              <w:fldChar w:fldCharType="begin"/>
+            </w:r>
+            <w:r>
+              <w:rPr>
+                <w:noProof/>
+                <w:webHidden/>
+              </w:rPr>
+              <w:instrText xml:space="preserve"> PAGEREF _Toc243734695 \h </w:instrText>
+            </w:r>
+            <w:r>
+              <w:rPr>
+                <w:noProof/>
+                <w:webHidden/>
+              </w:rPr>
+            </w:r>
+            <w:r>
+              <w:rPr>
+                <w:noProof/>
+                <w:webHidden/>
+              </w:rPr>
+              <w:fldChar w:fldCharType="separate"/>
+            </w:r>
+            <w:r>
+              <w:rPr>
+                <w:noProof/>
+                <w:webHidden/>
+              </w:rPr>
+              <w:t>18</w:t>
+            </w:r>
+            <w:r>
+              <w:rPr>
+                <w:noProof/>
+                <w:webHidden/>
+              </w:rPr>
+              <w:fldChar w:fldCharType="end"/>
+            </w:r>
+          </w:hyperlink>
+        </w:p>
+        <w:p>
+          <w:pPr>
+            <w:pStyle w:val="Obsah2"/>
+            <w:tabs>
+              <w:tab w:val="right" w:leader="dot" w:pos="9984"/>
+            </w:tabs>
+            <w:rPr>
+              <w:rFonts w:asciiTheme="minorHAnsi" w:hAnsiTheme="minorHAnsi"/>
+              <w:noProof/>
+              <w:color w:val="auto"/>
+              <w:kern w:val="2"/>
+              <w:sz w:val="24"/>
+              <w:szCs w:val="24"/>
+              <w:lang w:val="cs-CZ" w:eastAsia="cs-CZ"/>
+              <w14:ligatures w14:val="standardContextual"/>
+            </w:rPr>
+          </w:pPr>
+          <w:hyperlink w:anchor="_Toc243734696" w:history="1">
+            <w:r>
+              <w:rPr>
+                <w:rStyle w:val="Hypertextovodkaz"/>
+                <w:noProof/>
+              </w:rPr>
+              <w:t>Exp.8</w:t>
+            </w:r>
+            <w:r>
+              <w:rPr>
+                <w:noProof/>
+                <w:webHidden/>
+              </w:rPr>
+              <w:tab/>
+            </w:r>
+            <w:r>
+              <w:rPr>
+                <w:noProof/>
+                <w:webHidden/>
+              </w:rPr>
+              <w:fldChar w:fldCharType="begin"/>
+            </w:r>
+            <w:r>
+              <w:rPr>
+                <w:noProof/>
+                <w:webHidden/>
+              </w:rPr>
+              <w:instrText xml:space="preserve"> PAGEREF _Toc243734696 \h </w:instrText>
+            </w:r>
+            <w:r>
+              <w:rPr>
+                <w:noProof/>
+                <w:webHidden/>
+              </w:rPr>
+            </w:r>
+            <w:r>
+              <w:rPr>
+                <w:noProof/>
+                <w:webHidden/>
+              </w:rPr>
+              <w:fldChar w:fldCharType="separate"/>
+            </w:r>
+            <w:r>
+              <w:rPr>
+                <w:noProof/>
+                <w:webHidden/>
+              </w:rPr>
+              <w:t>19</w:t>
+            </w:r>
+            <w:r>
+              <w:rPr>
+                <w:noProof/>
+                <w:webHidden/>
+              </w:rPr>
+              <w:fldChar w:fldCharType="end"/>
+            </w:r>
+          </w:hyperlink>
+        </w:p>
+        <w:p>
+          <w:pPr>
+            <w:pStyle w:val="Obsah2"/>
+            <w:tabs>
+              <w:tab w:val="right" w:leader="dot" w:pos="9984"/>
+            </w:tabs>
+            <w:rPr>
+              <w:rFonts w:asciiTheme="minorHAnsi" w:hAnsiTheme="minorHAnsi"/>
+              <w:noProof/>
+              <w:color w:val="auto"/>
+              <w:kern w:val="2"/>
+              <w:sz w:val="24"/>
+              <w:szCs w:val="24"/>
+              <w:lang w:val="cs-CZ" w:eastAsia="cs-CZ"/>
+              <w14:ligatures w14:val="standardContextual"/>
+            </w:rPr>
+          </w:pPr>
+          <w:hyperlink w:anchor="_Toc243734697" w:history="1">
+            <w:r>
+              <w:rPr>
+                <w:rStyle w:val="Hypertextovodkaz"/>
+                <w:noProof/>
+              </w:rPr>
+              <w:t>Exp.9</w:t>
+            </w:r>
+            <w:r>
+              <w:rPr>
+                <w:noProof/>
+                <w:webHidden/>
+              </w:rPr>
+              <w:tab/>
+            </w:r>
+            <w:r>
+              <w:rPr>
+                <w:noProof/>
+                <w:webHidden/>
+              </w:rPr>
+              <w:fldChar w:fldCharType="begin"/>
+            </w:r>
+            <w:r>
+              <w:rPr>
+                <w:noProof/>
+                <w:webHidden/>
+              </w:rPr>
+              <w:instrText xml:space="preserve"> PAGEREF _Toc243734697 \h </w:instrText>
+            </w:r>
+            <w:r>
+              <w:rPr>
+                <w:noProof/>
+                <w:webHidden/>
+              </w:rPr>
+            </w:r>
+            <w:r>
+              <w:rPr>
+                <w:noProof/>
+                <w:webHidden/>
+              </w:rPr>
+              <w:fldChar w:fldCharType="separate"/>
+            </w:r>
+            <w:r>
+              <w:rPr>
+                <w:noProof/>
+                <w:webHidden/>
+              </w:rPr>
+              <w:t>20</w:t>
+            </w:r>
+            <w:r>
+              <w:rPr>
+                <w:noProof/>
+                <w:webHidden/>
+              </w:rPr>
+              <w:fldChar w:fldCharType="end"/>
+            </w:r>
+          </w:hyperlink>
+        </w:p>
+        <w:p>
+          <w:pPr>
+            <w:pStyle w:val="Obsah2"/>
+            <w:tabs>
+              <w:tab w:val="right" w:leader="dot" w:pos="9984"/>
+            </w:tabs>
+            <w:rPr>
+              <w:rFonts w:asciiTheme="minorHAnsi" w:hAnsiTheme="minorHAnsi"/>
+              <w:noProof/>
+              <w:color w:val="auto"/>
+              <w:kern w:val="2"/>
+              <w:sz w:val="24"/>
+              <w:szCs w:val="24"/>
+              <w:lang w:val="cs-CZ" w:eastAsia="cs-CZ"/>
+              <w14:ligatures w14:val="standardContextual"/>
+            </w:rPr>
+          </w:pPr>
+          <w:hyperlink w:anchor="_Toc243734698" w:history="1">
+            <w:r>
+              <w:rPr>
+                <w:rStyle w:val="Hypertextovodkaz"/>
+                <w:noProof/>
+              </w:rPr>
+              <w:t>Exp.10</w:t>
+            </w:r>
+            <w:r>
+              <w:rPr>
+                <w:noProof/>
+                <w:webHidden/>
+              </w:rPr>
+              <w:tab/>
+            </w:r>
+            <w:r>
+              <w:rPr>
+                <w:noProof/>
+                <w:webHidden/>
+              </w:rPr>
+              <w:fldChar w:fldCharType="begin"/>
+            </w:r>
+            <w:r>
+              <w:rPr>
+                <w:noProof/>
+                <w:webHidden/>
+              </w:rPr>
+              <w:instrText xml:space="preserve"> PAGEREF _Toc243734698 \h </w:instrText>
+            </w:r>
+            <w:r>
+              <w:rPr>
+                <w:noProof/>
+                <w:webHidden/>
+              </w:rPr>
+            </w:r>
+            <w:r>
+              <w:rPr>
+                <w:noProof/>
+                <w:webHidden/>
+              </w:rPr>
+              <w:fldChar w:fldCharType="separate"/>
+            </w:r>
+            <w:r>
+              <w:rPr>
+                <w:noProof/>
+                <w:webHidden/>
+              </w:rPr>
+              <w:t>21</w:t>
+            </w:r>
+            <w:r>
+              <w:rPr>
+                <w:noProof/>
+                <w:webHidden/>
+              </w:rPr>
+              <w:fldChar w:fldCharType="end"/>
+            </w:r>
+          </w:hyperlink>
+        </w:p>
+        <w:p>
+          <w:pPr>
+            <w:pStyle w:val="Obsah2"/>
+            <w:tabs>
+              <w:tab w:val="right" w:leader="dot" w:pos="9984"/>
+            </w:tabs>
+            <w:rPr>
+              <w:rFonts w:asciiTheme="minorHAnsi" w:hAnsiTheme="minorHAnsi"/>
+              <w:noProof/>
+              <w:color w:val="auto"/>
+              <w:kern w:val="2"/>
+              <w:sz w:val="24"/>
+              <w:szCs w:val="24"/>
+              <w:lang w:val="cs-CZ" w:eastAsia="cs-CZ"/>
+              <w14:ligatures w14:val="standardContextual"/>
+            </w:rPr>
+          </w:pPr>
+          <w:hyperlink w:anchor="_Toc243734699" w:history="1">
+            <w:r>
+              <w:rPr>
+                <w:rStyle w:val="Hypertextovodkaz"/>
+                <w:noProof/>
+              </w:rPr>
+              <w:t>Exp. 11</w:t>
+            </w:r>
+            <w:r>
+              <w:rPr>
+                <w:noProof/>
+                <w:webHidden/>
+              </w:rPr>
+              <w:tab/>
+            </w:r>
+            <w:r>
+              <w:rPr>
+                <w:noProof/>
+                <w:webHidden/>
+              </w:rPr>
+              <w:fldChar w:fldCharType="begin"/>
+            </w:r>
+            <w:r>
+              <w:rPr>
+                <w:noProof/>
+                <w:webHidden/>
+              </w:rPr>
+              <w:instrText xml:space="preserve"> PAGEREF _Toc243734699 \h </w:instrText>
+            </w:r>
+            <w:r>
+              <w:rPr>
+                <w:noProof/>
+                <w:webHidden/>
+              </w:rPr>
+            </w:r>
+            <w:r>
+              <w:rPr>
+                <w:noProof/>
+                <w:webHidden/>
+              </w:rPr>
+              <w:fldChar w:fldCharType="separate"/>
+            </w:r>
+            <w:r>
+              <w:rPr>
+                <w:noProof/>
+                <w:webHidden/>
+              </w:rPr>
+              <w:t>22</w:t>
+            </w:r>
+            <w:r>
+              <w:rPr>
+                <w:noProof/>
+                <w:webHidden/>
+              </w:rPr>
+              <w:fldChar w:fldCharType="end"/>
+            </w:r>
+          </w:hyperlink>
+        </w:p>
+        <w:p>
+          <w:pPr>
+            <w:pStyle w:val="Obsah2"/>
+            <w:tabs>
+              <w:tab w:val="right" w:leader="dot" w:pos="9984"/>
+            </w:tabs>
+            <w:rPr>
+              <w:rFonts w:asciiTheme="minorHAnsi" w:hAnsiTheme="minorHAnsi"/>
+              <w:noProof/>
+              <w:color w:val="auto"/>
+              <w:kern w:val="2"/>
+              <w:sz w:val="24"/>
+              <w:szCs w:val="24"/>
+              <w:lang w:val="cs-CZ" w:eastAsia="cs-CZ"/>
+              <w14:ligatures w14:val="standardContextual"/>
+            </w:rPr>
+          </w:pPr>
+          <w:hyperlink w:anchor="_Toc243734700" w:history="1">
+            <w:r>
+              <w:rPr>
+                <w:rStyle w:val="Hypertextovodkaz"/>
+                <w:noProof/>
+              </w:rPr>
+              <w:t>Exp. 12</w:t>
+            </w:r>
+            <w:r>
+              <w:rPr>
+                <w:noProof/>
+                <w:webHidden/>
+              </w:rPr>
+              <w:tab/>
+            </w:r>
+            <w:r>
+              <w:rPr>
+                <w:noProof/>
+                <w:webHidden/>
+              </w:rPr>
+              <w:fldChar w:fldCharType="begin"/>
+            </w:r>
+            <w:r>
+              <w:rPr>
+                <w:noProof/>
+                <w:webHidden/>
+              </w:rPr>
+              <w:instrText xml:space="preserve"> PAGEREF _Toc243734700 \h </w:instrText>
+            </w:r>
+            <w:r>
+              <w:rPr>
+                <w:noProof/>
+                <w:webHidden/>
+              </w:rPr>
+            </w:r>
+            <w:r>
+              <w:rPr>
+                <w:noProof/>
+                <w:webHidden/>
+              </w:rPr>
+              <w:fldChar w:fldCharType="separate"/>
+            </w:r>
+            <w:r>
+              <w:rPr>
+                <w:noProof/>
+                <w:webHidden/>
+              </w:rPr>
+              <w:t>23</w:t>
+            </w:r>
+            <w:r>
+              <w:rPr>
+                <w:noProof/>
+                <w:webHidden/>
+              </w:rPr>
+              <w:fldChar w:fldCharType="end"/>
+            </w:r>
+          </w:hyperlink>
+        </w:p>
+        <w:p>
+          <w:pPr>
+            <w:pStyle w:val="Obsah2"/>
+            <w:tabs>
+              <w:tab w:val="right" w:leader="dot" w:pos="9984"/>
+            </w:tabs>
+            <w:rPr>
+              <w:rFonts w:asciiTheme="minorHAnsi" w:hAnsiTheme="minorHAnsi"/>
+              <w:noProof/>
+              <w:color w:val="auto"/>
+              <w:kern w:val="2"/>
+              <w:sz w:val="24"/>
+              <w:szCs w:val="24"/>
+              <w:lang w:val="cs-CZ" w:eastAsia="cs-CZ"/>
+              <w14:ligatures w14:val="standardContextual"/>
+            </w:rPr>
+          </w:pPr>
+          <w:hyperlink w:anchor="_Toc243734701" w:history="1">
+            <w:r>
+              <w:rPr>
+                <w:rStyle w:val="Hypertextovodkaz"/>
+                <w:noProof/>
+              </w:rPr>
+              <w:t>Exp. 13</w:t>
+            </w:r>
+            <w:r>
+              <w:rPr>
+                <w:noProof/>
+                <w:webHidden/>
+              </w:rPr>
+              <w:tab/>
+            </w:r>
+            <w:r>
+              <w:rPr>
+                <w:noProof/>
+                <w:webHidden/>
+              </w:rPr>
+              <w:fldChar w:fldCharType="begin"/>
+            </w:r>
+            <w:r>
+              <w:rPr>
+                <w:noProof/>
+                <w:webHidden/>
+              </w:rPr>
+              <w:instrText xml:space="preserve"> PAGEREF _Toc243734701 \h </w:instrText>
+            </w:r>
+            <w:r>
+              <w:rPr>
+                <w:noProof/>
+                <w:webHidden/>
+              </w:rPr>
+            </w:r>
+            <w:r>
+              <w:rPr>
+                <w:noProof/>
+                <w:webHidden/>
+              </w:rPr>
+              <w:fldChar w:fldCharType="separate"/>
+            </w:r>
+            <w:r>
+              <w:rPr>
+                <w:noProof/>
+                <w:webHidden/>
+              </w:rPr>
+              <w:t>24</w:t>
             </w:r>
             <w:r>
               <w:rPr>
@@ -3355,7 +4513,6 @@
           <w:szCs w:val="28"/>
         </w:rPr>
       </w:pPr>
-      <w:bookmarkStart w:id="0" w:name="_Toc243725540"/>
       <w:r>
         <w:br w:type="page"/>
       </w:r>
@@ -3364,6 +4521,7 @@
       <w:pPr>
         <w:pStyle w:val="Nadpis1"/>
       </w:pPr>
+      <w:bookmarkStart w:id="0" w:name="_Toc243734663"/>
       <w:r>
         <w:lastRenderedPageBreak/>
         <w:t xml:space="preserve">1 </w:t>
@@ -3397,7 +4555,7 @@
       <w:pPr>
         <w:pStyle w:val="Nadpis2"/>
       </w:pPr>
-      <w:bookmarkStart w:id="1" w:name="_Toc243725541"/>
+      <w:bookmarkStart w:id="1" w:name="_Toc243734664"/>
       <w:r>
         <w:t>Rozsah funkcí</w:t>
       </w:r>
@@ -3455,7 +4613,7 @@
       <w:pPr>
         <w:pStyle w:val="Nadpis1"/>
       </w:pPr>
-      <w:bookmarkStart w:id="2" w:name="_Toc243725542"/>
+      <w:bookmarkStart w:id="2" w:name="_Toc243734665"/>
       <w:r>
         <w:t>2 Architektura a tok programu</w:t>
       </w:r>
@@ -3863,7 +5021,7 @@
       <w:pPr>
         <w:pStyle w:val="Nadpis2"/>
       </w:pPr>
-      <w:bookmarkStart w:id="3" w:name="_Toc243725543"/>
+      <w:bookmarkStart w:id="3" w:name="_Toc243734666"/>
       <w:r>
         <w:t>Průběh běhu</w:t>
       </w:r>
@@ -3913,7 +5071,7 @@
       <w:pPr>
         <w:pStyle w:val="Nadpis1"/>
       </w:pPr>
-      <w:bookmarkStart w:id="4" w:name="_Toc243725544"/>
+      <w:bookmarkStart w:id="4" w:name="_Toc243734667"/>
       <w:r>
         <w:t>3 Struktura projektu</w:t>
       </w:r>
@@ -4422,7 +5580,7 @@
       <w:pPr>
         <w:pStyle w:val="Nadpis2"/>
       </w:pPr>
-      <w:bookmarkStart w:id="5" w:name="_Toc243725545"/>
+      <w:bookmarkStart w:id="5" w:name="_Toc243734668"/>
       <w:r>
         <w:t>Vstupní obrázky</w:t>
       </w:r>
@@ -4437,7 +5595,7 @@
       <w:pPr>
         <w:pStyle w:val="Nadpis1"/>
       </w:pPr>
-      <w:bookmarkStart w:id="6" w:name="_Toc243725546"/>
+      <w:bookmarkStart w:id="6" w:name="_Toc243734669"/>
       <w:r>
         <w:t>4 Datový model</w:t>
       </w:r>
@@ -4447,7 +5605,7 @@
       <w:pPr>
         <w:pStyle w:val="Nadpis2"/>
       </w:pPr>
-      <w:bookmarkStart w:id="7" w:name="_Toc243725547"/>
+      <w:bookmarkStart w:id="7" w:name="_Toc243734670"/>
       <w:r>
         <w:t>MazeTitle</w:t>
       </w:r>
@@ -4507,7 +5665,7 @@
       <w:pPr>
         <w:pStyle w:val="Nadpis2"/>
       </w:pPr>
-      <w:bookmarkStart w:id="8" w:name="_Toc243725548"/>
+      <w:bookmarkStart w:id="8" w:name="_Toc243734671"/>
       <w:r>
         <w:t>MazeState</w:t>
       </w:r>
@@ -4834,7 +5992,7 @@
       <w:pPr>
         <w:pStyle w:val="Nadpis2"/>
       </w:pPr>
-      <w:bookmarkStart w:id="9" w:name="_Toc243725549"/>
+      <w:bookmarkStart w:id="9" w:name="_Toc243734672"/>
       <w:r>
         <w:t>Orientation</w:t>
       </w:r>
@@ -4849,7 +6007,7 @@
       <w:pPr>
         <w:pStyle w:val="Nadpis1"/>
       </w:pPr>
-      <w:bookmarkStart w:id="10" w:name="_Toc243725550"/>
+      <w:bookmarkStart w:id="10" w:name="_Toc243734673"/>
       <w:r>
         <w:lastRenderedPageBreak/>
         <w:t>5 Třída Maze</w:t>
@@ -4865,7 +6023,7 @@
       <w:pPr>
         <w:pStyle w:val="Nadpis2"/>
       </w:pPr>
-      <w:bookmarkStart w:id="11" w:name="_Toc243725551"/>
+      <w:bookmarkStart w:id="11" w:name="_Toc243734674"/>
       <w:r>
         <w:t>Načítání a sestavení mřížky</w:t>
       </w:r>
@@ -4965,7 +6123,7 @@
       <w:pPr>
         <w:pStyle w:val="Nadpis2"/>
       </w:pPr>
-      <w:bookmarkStart w:id="12" w:name="_Toc243725552"/>
+      <w:bookmarkStart w:id="12" w:name="_Toc243734675"/>
       <w:r>
         <w:t>Práce s průchodností</w:t>
       </w:r>
@@ -5035,7 +6193,7 @@
       <w:pPr>
         <w:pStyle w:val="Nadpis2"/>
       </w:pPr>
-      <w:bookmarkStart w:id="13" w:name="_Toc243725553"/>
+      <w:bookmarkStart w:id="13" w:name="_Toc243734676"/>
       <w:r>
         <w:t>Výstup a pomocné metody</w:t>
       </w:r>
@@ -5140,7 +6298,7 @@
       <w:pPr>
         <w:pStyle w:val="Nadpis1"/>
       </w:pPr>
-      <w:bookmarkStart w:id="14" w:name="_Toc243725554"/>
+      <w:bookmarkStart w:id="14" w:name="_Toc243734677"/>
       <w:r>
         <w:lastRenderedPageBreak/>
         <w:t>6 Vyhledávací algoritmus</w:t>
@@ -5151,7 +6309,7 @@
       <w:pPr>
         <w:pStyle w:val="Nadpis2"/>
       </w:pPr>
-      <w:bookmarkStart w:id="15" w:name="_Toc243725555"/>
+      <w:bookmarkStart w:id="15" w:name="_Toc243734678"/>
       <w:r>
         <w:t>AlgorithmA</w:t>
       </w:r>
@@ -5316,7 +6474,7 @@
       <w:pPr>
         <w:pStyle w:val="Nadpis3"/>
       </w:pPr>
-      <w:bookmarkStart w:id="16" w:name="_Toc243725556"/>
+      <w:bookmarkStart w:id="16" w:name="_Toc243734679"/>
       <w:r>
         <w:t>SearchListener</w:t>
       </w:r>
@@ -5331,7 +6489,7 @@
       <w:pPr>
         <w:pStyle w:val="Nadpis2"/>
       </w:pPr>
-      <w:bookmarkStart w:id="17" w:name="_Toc243725557"/>
+      <w:bookmarkStart w:id="17" w:name="_Toc243734680"/>
       <w:r>
         <w:t>Sort</w:t>
       </w:r>
@@ -5346,7 +6504,7 @@
       <w:pPr>
         <w:pStyle w:val="Nadpis1"/>
       </w:pPr>
-      <w:bookmarkStart w:id="18" w:name="_Toc243725558"/>
+      <w:bookmarkStart w:id="18" w:name="_Toc243734681"/>
       <w:r>
         <w:t>7 Uživatelské rozhraní MazeGui</w:t>
       </w:r>
@@ -5557,7 +6715,7 @@
       <w:pPr>
         <w:pStyle w:val="Nadpis1"/>
       </w:pPr>
-      <w:bookmarkStart w:id="19" w:name="_Toc243725559"/>
+      <w:bookmarkStart w:id="19" w:name="_Toc243734682"/>
       <w:r>
         <w:t>8 Uživatelský postup</w:t>
       </w:r>
@@ -5623,7 +6781,7 @@
       <w:pPr>
         <w:pStyle w:val="Nadpis2"/>
       </w:pPr>
-      <w:bookmarkStart w:id="20" w:name="_Toc243725560"/>
+      <w:bookmarkStart w:id="20" w:name="_Toc243734683"/>
       <w:r>
         <w:t>Ovládací prvky a aktuální chování</w:t>
       </w:r>
@@ -6044,7 +7202,7 @@
       <w:pPr>
         <w:pStyle w:val="Nadpis1"/>
       </w:pPr>
-      <w:bookmarkStart w:id="21" w:name="_Toc243725561"/>
+      <w:bookmarkStart w:id="21" w:name="_Toc243734684"/>
       <w:r>
         <w:t>9 Sestavení a závislosti</w:t>
       </w:r>
@@ -6215,92 +7373,30 @@
       <w:pPr>
         <w:pStyle w:val="Nadpis1"/>
       </w:pPr>
-      <w:bookmarkStart w:id="22" w:name="_Toc243725562"/>
-      <w:r>
-        <w:t>10 Omezení a technická rizika</w:t>
+      <w:bookmarkStart w:id="22" w:name="_Toc243734685"/>
+      <w:r>
+        <w:t>1</w:t>
+      </w:r>
+      <w:r>
+        <w:t>0</w:t>
+      </w:r>
+      <w:r>
+        <w:t xml:space="preserve"> </w:t>
+      </w:r>
+      <w:proofErr w:type="spellStart"/>
+      <w:r>
+        <w:t>Shrnutí</w:t>
+      </w:r>
+      <w:proofErr w:type="spellEnd"/>
+      <w:r>
+        <w:t xml:space="preserve"> </w:t>
+      </w:r>
+      <w:proofErr w:type="spellStart"/>
+      <w:r>
+        <w:t>tříd</w:t>
       </w:r>
       <w:bookmarkEnd w:id="22"/>
-    </w:p>
-    <w:p>
-      <w:pPr>
-        <w:pStyle w:val="Seznamsodrkami"/>
-      </w:pPr>
-      <w:r>
-        <w:t>Metoda MazeState.moveOnXAxiom kontroluje východní mez podmínkou xPosition != počet sloupců. Poslední platný sloupec má index počet sloupců − 1, takže tato kontrola může připustit krok mimo mřížku. AlgorithmA má vlastní předběžnou kontrolu, ta však nechrání všechna přímá volání MazeState.</w:t>
-      </w:r>
-    </w:p>
-    <w:p>
-      <w:pPr>
-        <w:pStyle w:val="Seznamsodrkami"/>
-      </w:pPr>
-      <w:r>
-        <w:t>PriorityQueue řadí podle vypočítaného skóre, ale při vložení již existujícího stavu se neaktualizuje jeho cena ani předchůdce. ClosedList navíc identifikuje stav pouze pozicí a orientací. Implementace proto nemusí vždy zachovat standardní záruky optimálního A* při nalezení levnější cesty k již známému stavu.</w:t>
-      </w:r>
-    </w:p>
-    <w:p>
-      <w:pPr>
-        <w:pStyle w:val="Seznamsodrkami"/>
-      </w:pPr>
-      <w:r>
-        <w:t>Matici opened transitions algoritmus využívá pro obrázky s koridorovou mřížkou a barevná bludiště; u ostatních obrázků se průchodnost odvozuje z logických buněk. Přesnost závisí na odhadu rozměrů, hranic a klasifikaci pixelů.</w:t>
-      </w:r>
-    </w:p>
-    <w:p>
-      <w:pPr>
-        <w:pStyle w:val="Seznamsodrkami"/>
-      </w:pPr>
-      <w:r>
-        <w:t>Tlačítko Pozastavit / pokračovat nemá akci. Tlačítko Vymazat vizualizaci maže pouze resultImage a je při běhu zakázané. Nelze tedy uživatelsky zastavit ani pozastavit hledání.</w:t>
-      </w:r>
-    </w:p>
-    <w:p>
-      <w:pPr>
-        <w:pStyle w:val="Seznamsodrkami"/>
-      </w:pPr>
-      <w:r>
-        <w:t>GUI po výpočtu čte výstup z pevně pojmenovaného souboru Bludiste-prosle.bmp. Pokud zápis nebo načtení selže, může se výsledek zpracovat jako chyba běhu.</w:t>
-      </w:r>
-    </w:p>
-    <w:p>
-      <w:pPr>
-        <w:pStyle w:val="Seznamsodrkami"/>
-      </w:pPr>
-      <w:r>
-        <w:t>Orientace je ve formuláři zakázaná a startovní směr nastavuje algoritmus na NORTH. Cíl se považuje za dosažený bez ohledu na výslednou orientaci.</w:t>
-      </w:r>
-    </w:p>
-    <w:p>
-      <w:pPr>
-        <w:pStyle w:val="Seznamsodrkami"/>
-      </w:pPr>
-      <w:r>
-        <w:t>V Main.runConsole je konzolový příklad zakomentovaný; aktivním vstupním bodem je JavaFX rozhraní.</w:t>
-      </w:r>
-    </w:p>
-    <w:p>
-      <w:pPr>
-        <w:pStyle w:val="Nadpis2"/>
-      </w:pPr>
-      <w:bookmarkStart w:id="23" w:name="_Toc243725563"/>
-      <w:r>
-        <w:t>Doporučené další kroky</w:t>
-      </w:r>
-      <w:bookmarkEnd w:id="23"/>
-    </w:p>
-    <w:p>
-      <w:r>
-        <w:t>Pro zvýšení robustnosti je vhodné sjednotit kontrolu mezí pohybu, implementovat aktualizaci ceny stavu v otevřené frontě (nebo použít mapu nejlepší známé ceny), doplnit skutečné pozastavení/zrušení běhu a předávat výstupní cestu explicitně místo pevného názvu souboru. Vhodné je rovněž doplnit automatizované testy převodu obrázku na mřížku a hledání na malých známých bludištích.</w:t>
-      </w:r>
-    </w:p>
-    <w:p>
-      <w:pPr>
-        <w:pStyle w:val="Nadpis1"/>
-      </w:pPr>
-      <w:bookmarkStart w:id="24" w:name="_Toc243725564"/>
-      <w:r>
-        <w:t>11 Shrnutí tříd</w:t>
-      </w:r>
-      <w:bookmarkEnd w:id="24"/>
+      <w:proofErr w:type="spellEnd"/>
     </w:p>
     <w:tbl>
       <w:tblPr>
@@ -6973,9 +8069,16 @@
       <w:pPr>
         <w:pStyle w:val="Nadpis1"/>
       </w:pPr>
+      <w:bookmarkStart w:id="23" w:name="_Toc243734686"/>
       <w:r>
         <w:lastRenderedPageBreak/>
-        <w:t xml:space="preserve">12 </w:t>
+        <w:t>1</w:t>
+      </w:r>
+      <w:r>
+        <w:t>1</w:t>
+      </w:r>
+      <w:r>
+        <w:t xml:space="preserve"> </w:t>
       </w:r>
       <w:proofErr w:type="spellStart"/>
       <w:r>
@@ -6989,6 +8092,7 @@
       <w:r>
         <w:t>algoritmů</w:t>
       </w:r>
+      <w:bookmarkEnd w:id="23"/>
       <w:proofErr w:type="spellEnd"/>
     </w:p>
     <w:p>
@@ -7314,27 +8418,142 @@
           <w:lang w:val="cs-CZ"/>
         </w:rPr>
       </w:pPr>
+      <w:r>
+        <w:rPr>
+          <w:lang w:val="cs-CZ"/>
+        </w:rPr>
+        <w:br w:type="page"/>
+      </w:r>
     </w:p>
     <w:p>
       <w:pPr>
-        <w:spacing w:after="200" w:line="276" w:lineRule="auto"/>
-      </w:pPr>
-      <w:r>
-        <w:br w:type="page"/>
+        <w:pStyle w:val="Nadpis1"/>
+        <w:rPr>
+          <w:lang w:val="cs-CZ"/>
+        </w:rPr>
+      </w:pPr>
+      <w:bookmarkStart w:id="24" w:name="_Toc243734687"/>
+      <w:r>
+        <w:rPr>
+          <w:lang w:val="cs-CZ"/>
+        </w:rPr>
+        <w:lastRenderedPageBreak/>
+        <w:t>12. Způsob rozpoznávání stěn a tolerance spektra</w:t>
+      </w:r>
+      <w:bookmarkEnd w:id="24"/>
+      <w:r>
+        <w:rPr>
+          <w:lang w:val="cs-CZ"/>
+        </w:rPr>
+        <w:t xml:space="preserve"> </w:t>
       </w:r>
     </w:p>
     <w:p>
       <w:pPr>
+        <w:spacing w:after="200" w:line="276" w:lineRule="auto"/>
+        <w:rPr>
+          <w:lang w:val="cs-CZ"/>
+        </w:rPr>
+      </w:pPr>
+      <w:r>
+        <w:rPr>
+          <w:lang w:val="cs-CZ"/>
+        </w:rPr>
+        <w:t>Rozpoznávání stěn a průchozích cest je realizováno převodem vstupního obrázku do logické bitmapy. Nejprve se určí hranice bludiště a odhadne se velikost jednotlivých polí. Následně se vyhodnotí barva pixelu ve středu každého pole, podle které se rozhodne, zda se jedná o průchozí cestu, nebo stěnu.</w:t>
+      </w:r>
+    </w:p>
+    <w:p>
+      <w:pPr>
+        <w:spacing w:after="200" w:line="276" w:lineRule="auto"/>
+        <w:rPr>
+          <w:lang w:val="cs-CZ"/>
+        </w:rPr>
+      </w:pPr>
+      <w:r>
+        <w:rPr>
+          <w:lang w:val="cs-CZ"/>
+        </w:rPr>
+        <w:t>U běžných bludišť se za průchozí považuje pixel, jehož všechny tři složky RGB mají hodnotu vyšší než 235. Tato podmínka umožňuje tolerovat drobné odchylky od čistě bílé barvy. Pixely, které podmínku nesplňují, jsou klasifikovány jako stěna.</w:t>
+      </w:r>
+    </w:p>
+    <w:p>
+      <w:pPr>
+        <w:spacing w:after="200" w:line="276" w:lineRule="auto"/>
+        <w:rPr>
+          <w:lang w:val="cs-CZ"/>
+        </w:rPr>
+      </w:pPr>
+      <w:r>
+        <w:rPr>
+          <w:lang w:val="cs-CZ"/>
+        </w:rPr>
+        <w:t>Pro vybrané barevné bludiště je použita samostatná podmínka, která zohledňuje světlost pixelu a rozdíl mezi jeho barevnými složkami. Nejnižší složka RGB musí mít hodnotu alespoň 210 a rozdíl mezi nejvyšší a nejnižší složkou nesmí překročit 60. Tím se rozpoznávají světlé, málo syté odstíny průchozích cest, zatímco výrazně barevné nebo tmavé pixely jsou klasifikovány jako stěny.</w:t>
+      </w:r>
+    </w:p>
+    <w:p>
+      <w:pPr>
+        <w:spacing w:after="200" w:line="276" w:lineRule="auto"/>
+        <w:rPr>
+          <w:lang w:val="cs-CZ"/>
+        </w:rPr>
+      </w:pPr>
+      <w:r>
+        <w:rPr>
+          <w:lang w:val="cs-CZ"/>
+        </w:rPr>
+        <w:t>U vybraných typů bludišť se navíc kontroluje průchodnost mezi sousedními poli. Přechod je povolen pouze tehdy, pokud obě pole představují průchozí cestu a alespoň 90 % kontrolovaných pixelů mezi jejich středy splňuje podmínku průchodnosti.</w:t>
+      </w:r>
+    </w:p>
+    <w:p>
+      <w:pPr>
+        <w:spacing w:after="200" w:line="276" w:lineRule="auto"/>
+        <w:rPr>
+          <w:lang w:val="cs-CZ"/>
+        </w:rPr>
+      </w:pPr>
+      <w:r>
+        <w:rPr>
+          <w:lang w:val="cs-CZ"/>
+        </w:rPr>
+        <w:t>Zvolený způsob představuje kombinaci barevného prahu a geometrické kontroly bludiště. Jeho omezením je, že velmi světlé nebo málo syté stěny mohou být v barevném režimu chybně vyhodnoceny jako cesta.</w:t>
+      </w:r>
+    </w:p>
+    <w:p>
+      <w:pPr>
+        <w:spacing w:after="200" w:line="276" w:lineRule="auto"/>
+        <w:rPr>
+          <w:lang w:val="cs-CZ"/>
+        </w:rPr>
+      </w:pPr>
+    </w:p>
+    <w:p>
+      <w:pPr>
+        <w:spacing w:after="200" w:line="276" w:lineRule="auto"/>
+      </w:pPr>
+      <w:r>
+        <w:br w:type="page"/>
+      </w:r>
+    </w:p>
+    <w:p>
+      <w:pPr>
         <w:pStyle w:val="Nadpis1"/>
       </w:pPr>
+      <w:bookmarkStart w:id="25" w:name="_Toc243734688"/>
       <w:r>
         <w:lastRenderedPageBreak/>
-        <w:t xml:space="preserve">13 </w:t>
+        <w:t>1</w:t>
+      </w:r>
+      <w:r>
+        <w:t>3</w:t>
+      </w:r>
+      <w:r>
+        <w:t xml:space="preserve"> </w:t>
       </w:r>
       <w:proofErr w:type="spellStart"/>
       <w:r>
         <w:t>Experimenty</w:t>
       </w:r>
+      <w:bookmarkEnd w:id="25"/>
       <w:proofErr w:type="spellEnd"/>
     </w:p>
     <w:p/>
@@ -7342,9 +8561,11 @@
       <w:pPr>
         <w:pStyle w:val="Nadpis2"/>
       </w:pPr>
+      <w:bookmarkStart w:id="26" w:name="_Toc243734689"/>
       <w:r>
         <w:t>Exp.1</w:t>
       </w:r>
+      <w:bookmarkEnd w:id="26"/>
     </w:p>
     <w:p>
       <w:r>
@@ -7400,10 +8621,12 @@
       <w:pPr>
         <w:pStyle w:val="Nadpis2"/>
       </w:pPr>
+      <w:bookmarkStart w:id="27" w:name="_Toc243734690"/>
       <w:r>
         <w:lastRenderedPageBreak/>
         <w:t>Exp.2</w:t>
       </w:r>
+      <w:bookmarkEnd w:id="27"/>
     </w:p>
     <w:p>
       <w:r>
@@ -7464,9 +8687,14 @@
       <w:pPr>
         <w:pStyle w:val="Nadpis2"/>
       </w:pPr>
+      <w:bookmarkStart w:id="28" w:name="_Toc243734691"/>
       <w:r>
         <w:lastRenderedPageBreak/>
-        <w:t xml:space="preserve">Exp.3 </w:t>
+        <w:t>Exp.3</w:t>
+      </w:r>
+      <w:bookmarkEnd w:id="28"/>
+      <w:r>
+        <w:t xml:space="preserve"> </w:t>
       </w:r>
     </w:p>
     <w:p>
@@ -7525,10 +8753,12 @@
       <w:pPr>
         <w:pStyle w:val="Nadpis2"/>
       </w:pPr>
+      <w:bookmarkStart w:id="29" w:name="_Toc243734692"/>
       <w:r>
         <w:lastRenderedPageBreak/>
         <w:t>Exp.4</w:t>
       </w:r>
+      <w:bookmarkEnd w:id="29"/>
     </w:p>
     <w:p>
       <w:r>
@@ -7586,10 +8816,12 @@
       <w:pPr>
         <w:pStyle w:val="Nadpis2"/>
       </w:pPr>
+      <w:bookmarkStart w:id="30" w:name="_Toc243734693"/>
       <w:r>
         <w:lastRenderedPageBreak/>
         <w:t>Exp.5</w:t>
       </w:r>
+      <w:bookmarkEnd w:id="30"/>
     </w:p>
     <w:p>
       <w:r>
@@ -7647,10 +8879,12 @@
       <w:pPr>
         <w:pStyle w:val="Nadpis2"/>
       </w:pPr>
+      <w:bookmarkStart w:id="31" w:name="_Toc243734694"/>
       <w:r>
         <w:lastRenderedPageBreak/>
         <w:t>Exp.6</w:t>
       </w:r>
+      <w:bookmarkEnd w:id="31"/>
     </w:p>
     <w:p>
       <w:r>
@@ -7708,10 +8942,12 @@
       <w:pPr>
         <w:pStyle w:val="Nadpis2"/>
       </w:pPr>
+      <w:bookmarkStart w:id="32" w:name="_Toc243734695"/>
       <w:r>
         <w:lastRenderedPageBreak/>
         <w:t>Exp.7</w:t>
       </w:r>
+      <w:bookmarkEnd w:id="32"/>
     </w:p>
     <w:p>
       <w:r>
@@ -7777,10 +9013,12 @@
       <w:pPr>
         <w:pStyle w:val="Nadpis2"/>
       </w:pPr>
+      <w:bookmarkStart w:id="33" w:name="_Toc243734696"/>
       <w:r>
         <w:lastRenderedPageBreak/>
         <w:t>Exp.8</w:t>
       </w:r>
+      <w:bookmarkEnd w:id="33"/>
     </w:p>
     <w:p>
       <w:r>
@@ -7846,10 +9084,12 @@
       <w:pPr>
         <w:pStyle w:val="Nadpis2"/>
       </w:pPr>
+      <w:bookmarkStart w:id="34" w:name="_Toc243734697"/>
       <w:r>
         <w:lastRenderedPageBreak/>
         <w:t>Exp.9</w:t>
       </w:r>
+      <w:bookmarkEnd w:id="34"/>
     </w:p>
     <w:p>
       <w:r>
@@ -7915,10 +9155,12 @@
       <w:pPr>
         <w:pStyle w:val="Nadpis2"/>
       </w:pPr>
+      <w:bookmarkStart w:id="35" w:name="_Toc243734698"/>
       <w:r>
         <w:lastRenderedPageBreak/>
         <w:t>Exp.10</w:t>
       </w:r>
+      <w:bookmarkEnd w:id="35"/>
     </w:p>
     <w:p>
       <w:r>
@@ -7984,10 +9226,12 @@
       <w:pPr>
         <w:pStyle w:val="Nadpis2"/>
       </w:pPr>
+      <w:bookmarkStart w:id="36" w:name="_Toc243734699"/>
       <w:r>
         <w:lastRenderedPageBreak/>
         <w:t>Exp. 11</w:t>
       </w:r>
+      <w:bookmarkEnd w:id="36"/>
     </w:p>
     <w:p>
       <w:r>
@@ -8046,10 +9290,12 @@
       <w:pPr>
         <w:pStyle w:val="Nadpis2"/>
       </w:pPr>
+      <w:bookmarkStart w:id="37" w:name="_Toc243734700"/>
       <w:r>
         <w:lastRenderedPageBreak/>
         <w:t>Exp. 12</w:t>
       </w:r>
+      <w:bookmarkEnd w:id="37"/>
     </w:p>
     <w:p>
       <w:r>
@@ -8107,10 +9353,12 @@
       <w:pPr>
         <w:pStyle w:val="Nadpis2"/>
       </w:pPr>
+      <w:bookmarkStart w:id="38" w:name="_Toc243734701"/>
       <w:r>
         <w:lastRenderedPageBreak/>
         <w:t>Exp. 13</w:t>
       </w:r>
+      <w:bookmarkEnd w:id="38"/>
     </w:p>
     <w:p>
       <w:r>

</xml_diff>